<commit_message>
define basic functions of calculator
</commit_message>
<xml_diff>
--- a/Meeting Minutes.docx
+++ b/Meeting Minutes.docx
@@ -6,6 +6,7 @@
       <w:pPr>
         <w:jc w:val="center"/>
       </w:pPr>
+      <w:bookmarkStart w:id="0" w:name="OLE_LINK1"/>
       <w:r>
         <w:t>Meeting Minutes 1</w:t>
       </w:r>
@@ -132,7 +133,215 @@
         <w:tab/>
         <w:t>Goal: have the basic interface done with simple functions</w:t>
       </w:r>
-    </w:p>
+      <w:r>
+        <w:br/>
+      </w:r>
+    </w:p>
+    <w:p>
+      <w:pPr>
+        <w:widowControl/>
+      </w:pPr>
+      <w:r>
+        <w:br w:type="page"/>
+      </w:r>
+    </w:p>
+    <w:p>
+      <w:pPr>
+        <w:jc w:val="center"/>
+      </w:pPr>
+      <w:r>
+        <w:lastRenderedPageBreak/>
+        <w:t xml:space="preserve">Meeting Minutes </w:t>
+      </w:r>
+      <w:r>
+        <w:t>2</w:t>
+      </w:r>
+    </w:p>
+    <w:p>
+      <w:r>
+        <w:t xml:space="preserve">Date: </w:t>
+      </w:r>
+      <w:r>
+        <w:t>12</w:t>
+      </w:r>
+      <w:r>
+        <w:t>/5/2026</w:t>
+      </w:r>
+    </w:p>
+    <w:p>
+      <w:r>
+        <w:t xml:space="preserve">Attendees: Simon and Gareth </w:t>
+      </w:r>
+    </w:p>
+    <w:p>
+      <w:r>
+        <w:t xml:space="preserve">Aims: </w:t>
+      </w:r>
+      <w:r>
+        <w:t xml:space="preserve">discuss functions of the </w:t>
+      </w:r>
+      <w:r>
+        <w:t>calculator</w:t>
+      </w:r>
+      <w:r>
+        <w:t xml:space="preserve"> </w:t>
+      </w:r>
+      <w:r>
+        <w:t xml:space="preserve">backend </w:t>
+      </w:r>
+      <w:r>
+        <w:t xml:space="preserve">and </w:t>
+      </w:r>
+      <w:proofErr w:type="spellStart"/>
+      <w:r>
+        <w:t>tkinter</w:t>
+      </w:r>
+      <w:proofErr w:type="spellEnd"/>
+      <w:r>
+        <w:t xml:space="preserve"> </w:t>
+      </w:r>
+    </w:p>
+    <w:p/>
+    <w:p>
+      <w:r>
+        <w:t xml:space="preserve">Agenda: </w:t>
+      </w:r>
+    </w:p>
+    <w:p>
+      <w:r>
+        <w:tab/>
+      </w:r>
+    </w:p>
+    <w:p>
+      <w:r>
+        <w:t>Discussion points:</w:t>
+      </w:r>
+    </w:p>
+    <w:p>
+      <w:r>
+        <w:tab/>
+      </w:r>
+      <w:r>
+        <w:t>Calculator backend:</w:t>
+      </w:r>
+    </w:p>
+    <w:p>
+      <w:r>
+        <w:tab/>
+      </w:r>
+      <w:r>
+        <w:tab/>
+      </w:r>
+    </w:p>
+    <w:p>
+      <w:r>
+        <w:tab/>
+      </w:r>
+    </w:p>
+    <w:p/>
+    <w:p>
+      <w:r>
+        <w:t>Action items:</w:t>
+      </w:r>
+    </w:p>
+    <w:p>
+      <w:r>
+        <w:tab/>
+      </w:r>
+    </w:p>
+    <w:p/>
+    <w:p>
+      <w:r>
+        <w:t xml:space="preserve">Next meeting: </w:t>
+      </w:r>
+    </w:p>
+    <w:p>
+      <w:r>
+        <w:tab/>
+        <w:t xml:space="preserve">Goal: </w:t>
+      </w:r>
+    </w:p>
+    <w:bookmarkEnd w:id="0"/>
+    <w:p>
+      <w:pPr>
+        <w:widowControl/>
+      </w:pPr>
+      <w:r>
+        <w:br w:type="page"/>
+      </w:r>
+    </w:p>
+    <w:p>
+      <w:pPr>
+        <w:jc w:val="center"/>
+      </w:pPr>
+      <w:r>
+        <w:lastRenderedPageBreak/>
+        <w:t xml:space="preserve">Meeting Minutes </w:t>
+      </w:r>
+      <w:r>
+        <w:t>3</w:t>
+      </w:r>
+    </w:p>
+    <w:p>
+      <w:r>
+        <w:t>Date: /5/2026</w:t>
+      </w:r>
+    </w:p>
+    <w:p>
+      <w:r>
+        <w:t xml:space="preserve">Attendees: Simon and Gareth </w:t>
+      </w:r>
+    </w:p>
+    <w:p>
+      <w:r>
+        <w:t xml:space="preserve">Aims: </w:t>
+      </w:r>
+    </w:p>
+    <w:p/>
+    <w:p>
+      <w:r>
+        <w:t xml:space="preserve">Agenda: </w:t>
+      </w:r>
+    </w:p>
+    <w:p>
+      <w:r>
+        <w:tab/>
+      </w:r>
+    </w:p>
+    <w:p>
+      <w:r>
+        <w:t>Discussion points:</w:t>
+      </w:r>
+    </w:p>
+    <w:p>
+      <w:r>
+        <w:tab/>
+      </w:r>
+    </w:p>
+    <w:p/>
+    <w:p>
+      <w:r>
+        <w:t>Action items:</w:t>
+      </w:r>
+    </w:p>
+    <w:p>
+      <w:r>
+        <w:tab/>
+      </w:r>
+    </w:p>
+    <w:p/>
+    <w:p>
+      <w:r>
+        <w:t xml:space="preserve">Next meeting: </w:t>
+      </w:r>
+    </w:p>
+    <w:p>
+      <w:r>
+        <w:tab/>
+        <w:t xml:space="preserve">Goal: </w:t>
+      </w:r>
+    </w:p>
+    <w:p/>
     <w:sectPr>
       <w:pgSz w:w="11906" w:h="16838"/>
       <w:pgMar w:top="1440" w:right="1800" w:bottom="1440" w:left="1800" w:header="851" w:footer="992" w:gutter="0"/>
@@ -540,18 +749,18 @@
     <w:lsdException w:name="Unresolved Mention" w:semiHidden="1" w:unhideWhenUsed="1"/>
     <w:lsdException w:name="Smart Link" w:semiHidden="1" w:unhideWhenUsed="1"/>
   </w:latentStyles>
-  <w:style w:type="paragraph" w:default="1" w:styleId="a">
+  <w:style w:type="paragraph" w:default="1" w:styleId="Normal">
     <w:name w:val="Normal"/>
     <w:qFormat/>
     <w:pPr>
       <w:widowControl w:val="0"/>
     </w:pPr>
   </w:style>
-  <w:style w:type="paragraph" w:styleId="1">
+  <w:style w:type="paragraph" w:styleId="Heading1">
     <w:name w:val="heading 1"/>
-    <w:basedOn w:val="a"/>
-    <w:next w:val="a"/>
-    <w:link w:val="10"/>
+    <w:basedOn w:val="Normal"/>
+    <w:next w:val="Normal"/>
+    <w:link w:val="Heading1Char"/>
     <w:uiPriority w:val="9"/>
     <w:qFormat/>
     <w:rsid w:val="00315081"/>
@@ -568,11 +777,11 @@
       <w:szCs w:val="48"/>
     </w:rPr>
   </w:style>
-  <w:style w:type="paragraph" w:styleId="2">
+  <w:style w:type="paragraph" w:styleId="Heading2">
     <w:name w:val="heading 2"/>
-    <w:basedOn w:val="a"/>
-    <w:next w:val="a"/>
-    <w:link w:val="20"/>
+    <w:basedOn w:val="Normal"/>
+    <w:next w:val="Normal"/>
+    <w:link w:val="Heading2Char"/>
     <w:uiPriority w:val="9"/>
     <w:semiHidden/>
     <w:unhideWhenUsed/>
@@ -591,11 +800,11 @@
       <w:szCs w:val="40"/>
     </w:rPr>
   </w:style>
-  <w:style w:type="paragraph" w:styleId="3">
+  <w:style w:type="paragraph" w:styleId="Heading3">
     <w:name w:val="heading 3"/>
-    <w:basedOn w:val="a"/>
-    <w:next w:val="a"/>
-    <w:link w:val="30"/>
+    <w:basedOn w:val="Normal"/>
+    <w:next w:val="Normal"/>
+    <w:link w:val="Heading3Char"/>
     <w:uiPriority w:val="9"/>
     <w:semiHidden/>
     <w:unhideWhenUsed/>
@@ -614,11 +823,11 @@
       <w:szCs w:val="32"/>
     </w:rPr>
   </w:style>
-  <w:style w:type="paragraph" w:styleId="4">
+  <w:style w:type="paragraph" w:styleId="Heading4">
     <w:name w:val="heading 4"/>
-    <w:basedOn w:val="a"/>
-    <w:next w:val="a"/>
-    <w:link w:val="40"/>
+    <w:basedOn w:val="Normal"/>
+    <w:next w:val="Normal"/>
+    <w:link w:val="Heading4Char"/>
     <w:uiPriority w:val="9"/>
     <w:semiHidden/>
     <w:unhideWhenUsed/>
@@ -637,11 +846,11 @@
       <w:szCs w:val="28"/>
     </w:rPr>
   </w:style>
-  <w:style w:type="paragraph" w:styleId="5">
+  <w:style w:type="paragraph" w:styleId="Heading5">
     <w:name w:val="heading 5"/>
-    <w:basedOn w:val="a"/>
-    <w:next w:val="a"/>
-    <w:link w:val="50"/>
+    <w:basedOn w:val="Normal"/>
+    <w:next w:val="Normal"/>
+    <w:link w:val="Heading5Char"/>
     <w:uiPriority w:val="9"/>
     <w:semiHidden/>
     <w:unhideWhenUsed/>
@@ -658,11 +867,11 @@
       <w:color w:val="0F4761" w:themeColor="accent1" w:themeShade="BF"/>
     </w:rPr>
   </w:style>
-  <w:style w:type="paragraph" w:styleId="6">
+  <w:style w:type="paragraph" w:styleId="Heading6">
     <w:name w:val="heading 6"/>
-    <w:basedOn w:val="a"/>
-    <w:next w:val="a"/>
-    <w:link w:val="60"/>
+    <w:basedOn w:val="Normal"/>
+    <w:next w:val="Normal"/>
+    <w:link w:val="Heading6Char"/>
     <w:uiPriority w:val="9"/>
     <w:semiHidden/>
     <w:unhideWhenUsed/>
@@ -679,11 +888,11 @@
       <w:color w:val="595959" w:themeColor="text1" w:themeTint="A6"/>
     </w:rPr>
   </w:style>
-  <w:style w:type="paragraph" w:styleId="7">
+  <w:style w:type="paragraph" w:styleId="Heading7">
     <w:name w:val="heading 7"/>
-    <w:basedOn w:val="a"/>
-    <w:next w:val="a"/>
-    <w:link w:val="70"/>
+    <w:basedOn w:val="Normal"/>
+    <w:next w:val="Normal"/>
+    <w:link w:val="Heading7Char"/>
     <w:uiPriority w:val="9"/>
     <w:semiHidden/>
     <w:unhideWhenUsed/>
@@ -701,11 +910,11 @@
       <w:color w:val="595959" w:themeColor="text1" w:themeTint="A6"/>
     </w:rPr>
   </w:style>
-  <w:style w:type="paragraph" w:styleId="8">
+  <w:style w:type="paragraph" w:styleId="Heading8">
     <w:name w:val="heading 8"/>
-    <w:basedOn w:val="a"/>
-    <w:next w:val="a"/>
-    <w:link w:val="80"/>
+    <w:basedOn w:val="Normal"/>
+    <w:next w:val="Normal"/>
+    <w:link w:val="Heading8Char"/>
     <w:uiPriority w:val="9"/>
     <w:semiHidden/>
     <w:unhideWhenUsed/>
@@ -723,11 +932,11 @@
       <w:color w:val="272727" w:themeColor="text1" w:themeTint="D8"/>
     </w:rPr>
   </w:style>
-  <w:style w:type="paragraph" w:styleId="9">
+  <w:style w:type="paragraph" w:styleId="Heading9">
     <w:name w:val="heading 9"/>
-    <w:basedOn w:val="a"/>
-    <w:next w:val="a"/>
-    <w:link w:val="90"/>
+    <w:basedOn w:val="Normal"/>
+    <w:next w:val="Normal"/>
+    <w:link w:val="Heading9Char"/>
     <w:uiPriority w:val="9"/>
     <w:semiHidden/>
     <w:unhideWhenUsed/>
@@ -745,13 +954,13 @@
       <w:color w:val="272727" w:themeColor="text1" w:themeTint="D8"/>
     </w:rPr>
   </w:style>
-  <w:style w:type="character" w:default="1" w:styleId="a0">
+  <w:style w:type="character" w:default="1" w:styleId="DefaultParagraphFont">
     <w:name w:val="Default Paragraph Font"/>
     <w:uiPriority w:val="1"/>
     <w:semiHidden/>
     <w:unhideWhenUsed/>
   </w:style>
-  <w:style w:type="table" w:default="1" w:styleId="a1">
+  <w:style w:type="table" w:default="1" w:styleId="TableNormal">
     <w:name w:val="Normal Table"/>
     <w:uiPriority w:val="99"/>
     <w:semiHidden/>
@@ -766,16 +975,16 @@
       </w:tblCellMar>
     </w:tblPr>
   </w:style>
-  <w:style w:type="numbering" w:default="1" w:styleId="a2">
+  <w:style w:type="numbering" w:default="1" w:styleId="NoList">
     <w:name w:val="No List"/>
     <w:uiPriority w:val="99"/>
     <w:semiHidden/>
     <w:unhideWhenUsed/>
   </w:style>
-  <w:style w:type="character" w:customStyle="1" w:styleId="10">
-    <w:name w:val="標題 1 字元"/>
-    <w:basedOn w:val="a0"/>
-    <w:link w:val="1"/>
+  <w:style w:type="character" w:customStyle="1" w:styleId="Heading1Char">
+    <w:name w:val="Heading 1 Char"/>
+    <w:basedOn w:val="DefaultParagraphFont"/>
+    <w:link w:val="Heading1"/>
     <w:uiPriority w:val="9"/>
     <w:rsid w:val="00315081"/>
     <w:rPr>
@@ -785,10 +994,10 @@
       <w:szCs w:val="48"/>
     </w:rPr>
   </w:style>
-  <w:style w:type="character" w:customStyle="1" w:styleId="20">
-    <w:name w:val="標題 2 字元"/>
-    <w:basedOn w:val="a0"/>
-    <w:link w:val="2"/>
+  <w:style w:type="character" w:customStyle="1" w:styleId="Heading2Char">
+    <w:name w:val="Heading 2 Char"/>
+    <w:basedOn w:val="DefaultParagraphFont"/>
+    <w:link w:val="Heading2"/>
     <w:uiPriority w:val="9"/>
     <w:semiHidden/>
     <w:rsid w:val="00315081"/>
@@ -799,10 +1008,10 @@
       <w:szCs w:val="40"/>
     </w:rPr>
   </w:style>
-  <w:style w:type="character" w:customStyle="1" w:styleId="30">
-    <w:name w:val="標題 3 字元"/>
-    <w:basedOn w:val="a0"/>
-    <w:link w:val="3"/>
+  <w:style w:type="character" w:customStyle="1" w:styleId="Heading3Char">
+    <w:name w:val="Heading 3 Char"/>
+    <w:basedOn w:val="DefaultParagraphFont"/>
+    <w:link w:val="Heading3"/>
     <w:uiPriority w:val="9"/>
     <w:semiHidden/>
     <w:rsid w:val="00315081"/>
@@ -813,10 +1022,10 @@
       <w:szCs w:val="32"/>
     </w:rPr>
   </w:style>
-  <w:style w:type="character" w:customStyle="1" w:styleId="40">
-    <w:name w:val="標題 4 字元"/>
-    <w:basedOn w:val="a0"/>
-    <w:link w:val="4"/>
+  <w:style w:type="character" w:customStyle="1" w:styleId="Heading4Char">
+    <w:name w:val="Heading 4 Char"/>
+    <w:basedOn w:val="DefaultParagraphFont"/>
+    <w:link w:val="Heading4"/>
     <w:uiPriority w:val="9"/>
     <w:semiHidden/>
     <w:rsid w:val="00315081"/>
@@ -827,10 +1036,10 @@
       <w:szCs w:val="28"/>
     </w:rPr>
   </w:style>
-  <w:style w:type="character" w:customStyle="1" w:styleId="50">
-    <w:name w:val="標題 5 字元"/>
-    <w:basedOn w:val="a0"/>
-    <w:link w:val="5"/>
+  <w:style w:type="character" w:customStyle="1" w:styleId="Heading5Char">
+    <w:name w:val="Heading 5 Char"/>
+    <w:basedOn w:val="DefaultParagraphFont"/>
+    <w:link w:val="Heading5"/>
     <w:uiPriority w:val="9"/>
     <w:semiHidden/>
     <w:rsid w:val="00315081"/>
@@ -839,10 +1048,10 @@
       <w:color w:val="0F4761" w:themeColor="accent1" w:themeShade="BF"/>
     </w:rPr>
   </w:style>
-  <w:style w:type="character" w:customStyle="1" w:styleId="60">
-    <w:name w:val="標題 6 字元"/>
-    <w:basedOn w:val="a0"/>
-    <w:link w:val="6"/>
+  <w:style w:type="character" w:customStyle="1" w:styleId="Heading6Char">
+    <w:name w:val="Heading 6 Char"/>
+    <w:basedOn w:val="DefaultParagraphFont"/>
+    <w:link w:val="Heading6"/>
     <w:uiPriority w:val="9"/>
     <w:semiHidden/>
     <w:rsid w:val="00315081"/>
@@ -851,10 +1060,10 @@
       <w:color w:val="595959" w:themeColor="text1" w:themeTint="A6"/>
     </w:rPr>
   </w:style>
-  <w:style w:type="character" w:customStyle="1" w:styleId="70">
-    <w:name w:val="標題 7 字元"/>
-    <w:basedOn w:val="a0"/>
-    <w:link w:val="7"/>
+  <w:style w:type="character" w:customStyle="1" w:styleId="Heading7Char">
+    <w:name w:val="Heading 7 Char"/>
+    <w:basedOn w:val="DefaultParagraphFont"/>
+    <w:link w:val="Heading7"/>
     <w:uiPriority w:val="9"/>
     <w:semiHidden/>
     <w:rsid w:val="00315081"/>
@@ -863,10 +1072,10 @@
       <w:color w:val="595959" w:themeColor="text1" w:themeTint="A6"/>
     </w:rPr>
   </w:style>
-  <w:style w:type="character" w:customStyle="1" w:styleId="80">
-    <w:name w:val="標題 8 字元"/>
-    <w:basedOn w:val="a0"/>
-    <w:link w:val="8"/>
+  <w:style w:type="character" w:customStyle="1" w:styleId="Heading8Char">
+    <w:name w:val="Heading 8 Char"/>
+    <w:basedOn w:val="DefaultParagraphFont"/>
+    <w:link w:val="Heading8"/>
     <w:uiPriority w:val="9"/>
     <w:semiHidden/>
     <w:rsid w:val="00315081"/>
@@ -875,10 +1084,10 @@
       <w:color w:val="272727" w:themeColor="text1" w:themeTint="D8"/>
     </w:rPr>
   </w:style>
-  <w:style w:type="character" w:customStyle="1" w:styleId="90">
-    <w:name w:val="標題 9 字元"/>
-    <w:basedOn w:val="a0"/>
-    <w:link w:val="9"/>
+  <w:style w:type="character" w:customStyle="1" w:styleId="Heading9Char">
+    <w:name w:val="Heading 9 Char"/>
+    <w:basedOn w:val="DefaultParagraphFont"/>
+    <w:link w:val="Heading9"/>
     <w:uiPriority w:val="9"/>
     <w:semiHidden/>
     <w:rsid w:val="00315081"/>
@@ -887,11 +1096,11 @@
       <w:color w:val="272727" w:themeColor="text1" w:themeTint="D8"/>
     </w:rPr>
   </w:style>
-  <w:style w:type="paragraph" w:styleId="a3">
+  <w:style w:type="paragraph" w:styleId="Title">
     <w:name w:val="Title"/>
-    <w:basedOn w:val="a"/>
-    <w:next w:val="a"/>
-    <w:link w:val="a4"/>
+    <w:basedOn w:val="Normal"/>
+    <w:next w:val="Normal"/>
+    <w:link w:val="TitleChar"/>
     <w:uiPriority w:val="10"/>
     <w:qFormat/>
     <w:rsid w:val="00315081"/>
@@ -908,10 +1117,10 @@
       <w:szCs w:val="56"/>
     </w:rPr>
   </w:style>
-  <w:style w:type="character" w:customStyle="1" w:styleId="a4">
-    <w:name w:val="標題 字元"/>
-    <w:basedOn w:val="a0"/>
-    <w:link w:val="a3"/>
+  <w:style w:type="character" w:customStyle="1" w:styleId="TitleChar">
+    <w:name w:val="Title Char"/>
+    <w:basedOn w:val="DefaultParagraphFont"/>
+    <w:link w:val="Title"/>
     <w:uiPriority w:val="10"/>
     <w:rsid w:val="00315081"/>
     <w:rPr>
@@ -922,11 +1131,11 @@
       <w:szCs w:val="56"/>
     </w:rPr>
   </w:style>
-  <w:style w:type="paragraph" w:styleId="a5">
+  <w:style w:type="paragraph" w:styleId="Subtitle">
     <w:name w:val="Subtitle"/>
-    <w:basedOn w:val="a"/>
-    <w:next w:val="a"/>
-    <w:link w:val="a6"/>
+    <w:basedOn w:val="Normal"/>
+    <w:next w:val="Normal"/>
+    <w:link w:val="SubtitleChar"/>
     <w:uiPriority w:val="11"/>
     <w:qFormat/>
     <w:rsid w:val="00315081"/>
@@ -944,10 +1153,10 @@
       <w:szCs w:val="28"/>
     </w:rPr>
   </w:style>
-  <w:style w:type="character" w:customStyle="1" w:styleId="a6">
-    <w:name w:val="副標題 字元"/>
-    <w:basedOn w:val="a0"/>
-    <w:link w:val="a5"/>
+  <w:style w:type="character" w:customStyle="1" w:styleId="SubtitleChar">
+    <w:name w:val="Subtitle Char"/>
+    <w:basedOn w:val="DefaultParagraphFont"/>
+    <w:link w:val="Subtitle"/>
     <w:uiPriority w:val="11"/>
     <w:rsid w:val="00315081"/>
     <w:rPr>
@@ -958,11 +1167,11 @@
       <w:szCs w:val="28"/>
     </w:rPr>
   </w:style>
-  <w:style w:type="paragraph" w:styleId="a7">
+  <w:style w:type="paragraph" w:styleId="Quote">
     <w:name w:val="Quote"/>
-    <w:basedOn w:val="a"/>
-    <w:next w:val="a"/>
-    <w:link w:val="a8"/>
+    <w:basedOn w:val="Normal"/>
+    <w:next w:val="Normal"/>
+    <w:link w:val="QuoteChar"/>
     <w:uiPriority w:val="29"/>
     <w:qFormat/>
     <w:rsid w:val="00315081"/>
@@ -976,10 +1185,10 @@
       <w:color w:val="404040" w:themeColor="text1" w:themeTint="BF"/>
     </w:rPr>
   </w:style>
-  <w:style w:type="character" w:customStyle="1" w:styleId="a8">
-    <w:name w:val="引文 字元"/>
-    <w:basedOn w:val="a0"/>
-    <w:link w:val="a7"/>
+  <w:style w:type="character" w:customStyle="1" w:styleId="QuoteChar">
+    <w:name w:val="Quote Char"/>
+    <w:basedOn w:val="DefaultParagraphFont"/>
+    <w:link w:val="Quote"/>
     <w:uiPriority w:val="29"/>
     <w:rsid w:val="00315081"/>
     <w:rPr>
@@ -988,9 +1197,9 @@
       <w:color w:val="404040" w:themeColor="text1" w:themeTint="BF"/>
     </w:rPr>
   </w:style>
-  <w:style w:type="paragraph" w:styleId="a9">
+  <w:style w:type="paragraph" w:styleId="ListParagraph">
     <w:name w:val="List Paragraph"/>
-    <w:basedOn w:val="a"/>
+    <w:basedOn w:val="Normal"/>
     <w:uiPriority w:val="34"/>
     <w:qFormat/>
     <w:rsid w:val="00315081"/>
@@ -999,9 +1208,9 @@
       <w:contextualSpacing/>
     </w:pPr>
   </w:style>
-  <w:style w:type="character" w:styleId="aa">
+  <w:style w:type="character" w:styleId="IntenseEmphasis">
     <w:name w:val="Intense Emphasis"/>
-    <w:basedOn w:val="a0"/>
+    <w:basedOn w:val="DefaultParagraphFont"/>
     <w:uiPriority w:val="21"/>
     <w:qFormat/>
     <w:rsid w:val="00315081"/>
@@ -1011,11 +1220,11 @@
       <w:color w:val="0F4761" w:themeColor="accent1" w:themeShade="BF"/>
     </w:rPr>
   </w:style>
-  <w:style w:type="paragraph" w:styleId="ab">
+  <w:style w:type="paragraph" w:styleId="IntenseQuote">
     <w:name w:val="Intense Quote"/>
-    <w:basedOn w:val="a"/>
-    <w:next w:val="a"/>
-    <w:link w:val="ac"/>
+    <w:basedOn w:val="Normal"/>
+    <w:next w:val="Normal"/>
+    <w:link w:val="IntenseQuoteChar"/>
     <w:uiPriority w:val="30"/>
     <w:qFormat/>
     <w:rsid w:val="00315081"/>
@@ -1034,10 +1243,10 @@
       <w:color w:val="0F4761" w:themeColor="accent1" w:themeShade="BF"/>
     </w:rPr>
   </w:style>
-  <w:style w:type="character" w:customStyle="1" w:styleId="ac">
-    <w:name w:val="鮮明引文 字元"/>
-    <w:basedOn w:val="a0"/>
-    <w:link w:val="ab"/>
+  <w:style w:type="character" w:customStyle="1" w:styleId="IntenseQuoteChar">
+    <w:name w:val="Intense Quote Char"/>
+    <w:basedOn w:val="DefaultParagraphFont"/>
+    <w:link w:val="IntenseQuote"/>
     <w:uiPriority w:val="30"/>
     <w:rsid w:val="00315081"/>
     <w:rPr>
@@ -1046,9 +1255,9 @@
       <w:color w:val="0F4761" w:themeColor="accent1" w:themeShade="BF"/>
     </w:rPr>
   </w:style>
-  <w:style w:type="character" w:styleId="ad">
+  <w:style w:type="character" w:styleId="IntenseReference">
     <w:name w:val="Intense Reference"/>
-    <w:basedOn w:val="a0"/>
+    <w:basedOn w:val="DefaultParagraphFont"/>
     <w:uiPriority w:val="32"/>
     <w:qFormat/>
     <w:rsid w:val="00315081"/>

</xml_diff>

<commit_message>
add change mode function
also add self for each function
</commit_message>
<xml_diff>
--- a/Meeting Minutes.docx
+++ b/Meeting Minutes.docx
@@ -37,8 +37,20 @@
     </w:p>
     <w:p/>
     <w:p>
-      <w:r>
-        <w:t xml:space="preserve">Agenda: </w:t>
+      <w:pPr>
+        <w:rPr>
+          <w:b/>
+          <w:bCs/>
+          <w:u w:val="single"/>
+        </w:rPr>
+      </w:pPr>
+      <w:r>
+        <w:rPr>
+          <w:b/>
+          <w:bCs/>
+          <w:u w:val="single"/>
+        </w:rPr>
+        <w:t>Agenda</w:t>
       </w:r>
     </w:p>
     <w:p>
@@ -59,11 +71,20 @@
       </w:r>
     </w:p>
     <w:p>
-      <w:r>
+      <w:pPr>
+        <w:rPr>
+          <w:b/>
+          <w:bCs/>
+          <w:u w:val="single"/>
+        </w:rPr>
+      </w:pPr>
+      <w:r>
+        <w:rPr>
+          <w:b/>
+          <w:bCs/>
+          <w:u w:val="single"/>
+        </w:rPr>
         <w:t>Discussion points</w:t>
-      </w:r>
-      <w:r>
-        <w:t>:</w:t>
       </w:r>
     </w:p>
     <w:p>
@@ -102,8 +123,20 @@
       </w:r>
     </w:p>
     <w:p>
-      <w:r>
-        <w:t>Action items:</w:t>
+      <w:pPr>
+        <w:rPr>
+          <w:b/>
+          <w:bCs/>
+          <w:u w:val="single"/>
+        </w:rPr>
+      </w:pPr>
+      <w:r>
+        <w:rPr>
+          <w:b/>
+          <w:bCs/>
+          <w:u w:val="single"/>
+        </w:rPr>
+        <w:t>Action items</w:t>
       </w:r>
     </w:p>
     <w:p>
@@ -122,7 +155,15 @@
     </w:p>
     <w:p>
       <w:r>
-        <w:t>Next meeting:</w:t>
+        <w:rPr>
+          <w:b/>
+          <w:bCs/>
+          <w:u w:val="single"/>
+        </w:rPr>
+        <w:t>Next meeting</w:t>
+      </w:r>
+      <w:r>
+        <w:t>:</w:t>
       </w:r>
       <w:r>
         <w:t xml:space="preserve"> 12/5/2026 (723 Lesson)</w:t>
@@ -133,6 +174,714 @@
         <w:tab/>
         <w:t>Goal: have the basic interface done with simple functions</w:t>
       </w:r>
+    </w:p>
+    <w:p/>
+    <w:p/>
+    <w:p/>
+    <w:p/>
+    <w:p/>
+    <w:p/>
+    <w:p/>
+    <w:p/>
+    <w:p/>
+    <w:p/>
+    <w:p>
+      <w:r>
+        <w:t>Meeting Minutes 2</w:t>
+      </w:r>
+    </w:p>
+    <w:p/>
+    <w:p>
+      <w:r>
+        <w:t>Date: 12/5/2026</w:t>
+      </w:r>
+    </w:p>
+    <w:p>
+      <w:r>
+        <w:t>Attendees: Simon and Gareth</w:t>
+      </w:r>
+    </w:p>
+    <w:p>
+      <w:r>
+        <w:t xml:space="preserve">Aims: Discuss calculator backend functions and </w:t>
+      </w:r>
+      <w:proofErr w:type="spellStart"/>
+      <w:r>
+        <w:t>Tkinter</w:t>
+      </w:r>
+      <w:proofErr w:type="spellEnd"/>
+      <w:r>
+        <w:t xml:space="preserve"> GUI progress</w:t>
+      </w:r>
+    </w:p>
+    <w:p/>
+    <w:p>
+      <w:pPr>
+        <w:rPr>
+          <w:b/>
+          <w:bCs/>
+          <w:u w:val="single"/>
+        </w:rPr>
+      </w:pPr>
+      <w:r>
+        <w:rPr>
+          <w:b/>
+          <w:bCs/>
+          <w:u w:val="single"/>
+        </w:rPr>
+        <w:t>Agenda</w:t>
+      </w:r>
+    </w:p>
+    <w:p>
+      <w:r>
+        <w:t>Check progress from the first meeting</w:t>
+      </w:r>
+    </w:p>
+    <w:p>
+      <w:r>
+        <w:t>Discuss backend functions</w:t>
+      </w:r>
+    </w:p>
+    <w:p>
+      <w:r>
+        <w:t xml:space="preserve">Discuss </w:t>
+      </w:r>
+      <w:proofErr w:type="spellStart"/>
+      <w:r>
+        <w:t>Tkinter</w:t>
+      </w:r>
+      <w:proofErr w:type="spellEnd"/>
+      <w:r>
+        <w:t xml:space="preserve"> interface layout</w:t>
+      </w:r>
+    </w:p>
+    <w:p>
+      <w:r>
+        <w:t>Decide what functions should be added next</w:t>
+      </w:r>
+    </w:p>
+    <w:p/>
+    <w:p>
+      <w:pPr>
+        <w:rPr>
+          <w:b/>
+          <w:bCs/>
+          <w:u w:val="single"/>
+        </w:rPr>
+      </w:pPr>
+      <w:r>
+        <w:rPr>
+          <w:b/>
+          <w:bCs/>
+          <w:u w:val="single"/>
+        </w:rPr>
+        <w:t>Discussion Points</w:t>
+      </w:r>
+    </w:p>
+    <w:p>
+      <w:r>
+        <w:t>Calculator Backend</w:t>
+      </w:r>
+      <w:r>
+        <w:t xml:space="preserve"> operations: </w:t>
+      </w:r>
+      <w:r>
+        <w:t>(Simon)</w:t>
+      </w:r>
+    </w:p>
+    <w:p>
+      <w:r>
+        <w:t>Addition</w:t>
+      </w:r>
+    </w:p>
+    <w:p>
+      <w:r>
+        <w:t>Subtraction</w:t>
+      </w:r>
+    </w:p>
+    <w:p>
+      <w:r>
+        <w:t>Multiplication</w:t>
+      </w:r>
+    </w:p>
+    <w:p>
+      <w:r>
+        <w:t>Division</w:t>
+      </w:r>
+    </w:p>
+    <w:p>
+      <w:r>
+        <w:t>Error handing should be added to stop the program from crashing.</w:t>
+      </w:r>
+    </w:p>
+    <w:p>
+      <w:r>
+        <w:t>R</w:t>
+      </w:r>
+      <w:r>
+        <w:t>eturn an error message if the user divides by 0.</w:t>
+      </w:r>
+    </w:p>
+    <w:p/>
+    <w:p>
+      <w:proofErr w:type="spellStart"/>
+      <w:r>
+        <w:t>Tkinter</w:t>
+      </w:r>
+      <w:proofErr w:type="spellEnd"/>
+      <w:r>
+        <w:t xml:space="preserve"> GUI</w:t>
+      </w:r>
+    </w:p>
+    <w:p>
+      <w:r>
+        <w:t xml:space="preserve">The GUI </w:t>
+      </w:r>
+      <w:r>
+        <w:t>functions: (Gareth)</w:t>
+      </w:r>
+    </w:p>
+    <w:p>
+      <w:r>
+        <w:t>Display box</w:t>
+      </w:r>
+    </w:p>
+    <w:p>
+      <w:r>
+        <w:t>Number buttons</w:t>
+      </w:r>
+    </w:p>
+    <w:p>
+      <w:r>
+        <w:t>Operator buttons</w:t>
+      </w:r>
+    </w:p>
+    <w:p>
+      <w:r>
+        <w:t xml:space="preserve">Clear button </w:t>
+      </w:r>
+    </w:p>
+    <w:p>
+      <w:r>
+        <w:t>Delete button</w:t>
+      </w:r>
+    </w:p>
+    <w:p>
+      <w:r>
+        <w:t>Equal button</w:t>
+      </w:r>
+    </w:p>
+    <w:p/>
+    <w:p>
+      <w:r>
+        <w:t>Action Items</w:t>
+      </w:r>
+    </w:p>
+    <w:tbl>
+      <w:tblPr>
+        <w:tblStyle w:val="TableGrid"/>
+        <w:tblW w:w="0" w:type="auto"/>
+        <w:tblLook w:val="06A0" w:firstRow="1" w:lastRow="0" w:firstColumn="1" w:lastColumn="0" w:noHBand="1" w:noVBand="1"/>
+      </w:tblPr>
+      <w:tblGrid>
+        <w:gridCol w:w="4406"/>
+        <w:gridCol w:w="3890"/>
+      </w:tblGrid>
+      <w:tr>
+        <w:trPr>
+          <w:trHeight w:val="300"/>
+        </w:trPr>
+        <w:tc>
+          <w:tcPr>
+            <w:tcW w:w="4470" w:type="dxa"/>
+          </w:tcPr>
+          <w:p>
+            <w:r>
+              <w:t>Task</w:t>
+            </w:r>
+          </w:p>
+        </w:tc>
+        <w:tc>
+          <w:tcPr>
+            <w:tcW w:w="3945" w:type="dxa"/>
+          </w:tcPr>
+          <w:p>
+            <w:r>
+              <w:t>Person Responsible</w:t>
+            </w:r>
+          </w:p>
+        </w:tc>
+      </w:tr>
+      <w:tr>
+        <w:trPr>
+          <w:trHeight w:val="300"/>
+        </w:trPr>
+        <w:tc>
+          <w:tcPr>
+            <w:tcW w:w="4470" w:type="dxa"/>
+          </w:tcPr>
+          <w:p>
+            <w:r>
+              <w:t>Complete basic backend calculation functions</w:t>
+            </w:r>
+          </w:p>
+        </w:tc>
+        <w:tc>
+          <w:tcPr>
+            <w:tcW w:w="3945" w:type="dxa"/>
+          </w:tcPr>
+          <w:p>
+            <w:r>
+              <w:t>Simon</w:t>
+            </w:r>
+          </w:p>
+        </w:tc>
+      </w:tr>
+      <w:tr>
+        <w:trPr>
+          <w:trHeight w:val="300"/>
+        </w:trPr>
+        <w:tc>
+          <w:tcPr>
+            <w:tcW w:w="4470" w:type="dxa"/>
+          </w:tcPr>
+          <w:p>
+            <w:r>
+              <w:t>Complete calculator button layout</w:t>
+            </w:r>
+          </w:p>
+        </w:tc>
+        <w:tc>
+          <w:tcPr>
+            <w:tcW w:w="3945" w:type="dxa"/>
+          </w:tcPr>
+          <w:p>
+            <w:r>
+              <w:t>Gareth</w:t>
+            </w:r>
+          </w:p>
+        </w:tc>
+      </w:tr>
+      <w:tr>
+        <w:trPr>
+          <w:trHeight w:val="300"/>
+        </w:trPr>
+        <w:tc>
+          <w:tcPr>
+            <w:tcW w:w="4470" w:type="dxa"/>
+          </w:tcPr>
+          <w:p>
+            <w:r>
+              <w:t>Connect GUI buttons with backend functions</w:t>
+            </w:r>
+          </w:p>
+        </w:tc>
+        <w:tc>
+          <w:tcPr>
+            <w:tcW w:w="3945" w:type="dxa"/>
+          </w:tcPr>
+          <w:p>
+            <w:r>
+              <w:t>Simon and Gareth</w:t>
+            </w:r>
+          </w:p>
+        </w:tc>
+      </w:tr>
+      <w:tr>
+        <w:trPr>
+          <w:trHeight w:val="1065"/>
+        </w:trPr>
+        <w:tc>
+          <w:tcPr>
+            <w:tcW w:w="4470" w:type="dxa"/>
+          </w:tcPr>
+          <w:p>
+            <w:r>
+              <w:t>Test addition, subtraction, multiplication and division</w:t>
+            </w:r>
+          </w:p>
+        </w:tc>
+        <w:tc>
+          <w:tcPr>
+            <w:tcW w:w="3945" w:type="dxa"/>
+          </w:tcPr>
+          <w:p>
+            <w:r>
+              <w:t>Simon and Gareth</w:t>
+            </w:r>
+          </w:p>
+        </w:tc>
+      </w:tr>
+    </w:tbl>
+    <w:p/>
+    <w:p>
+      <w:r>
+        <w:t>Next Meeting</w:t>
+      </w:r>
+    </w:p>
+    <w:p>
+      <w:r>
+        <w:t>Date: 19/5/2026</w:t>
+      </w:r>
+    </w:p>
+    <w:p>
+      <w:r>
+        <w:t>Goa</w:t>
+      </w:r>
+      <w:r>
+        <w:t>l: Add scientific functions such as square root and trigonometric functions.</w:t>
+      </w:r>
+    </w:p>
+    <w:p/>
+    <w:p/>
+    <w:p/>
+    <w:p/>
+    <w:p/>
+    <w:p/>
+    <w:p/>
+    <w:p>
+      <w:r>
+        <w:t>Meeting Minutes 3</w:t>
+      </w:r>
+    </w:p>
+    <w:p>
+      <w:r>
+        <w:t>Date: 19/5/2026</w:t>
+      </w:r>
+    </w:p>
+    <w:p>
+      <w:r>
+        <w:t>Attendees: Simon and Gareth</w:t>
+      </w:r>
+    </w:p>
+    <w:p>
+      <w:r>
+        <w:t>Aims: Add advanced calculator functions and improve error handing</w:t>
+      </w:r>
+    </w:p>
+    <w:p/>
+    <w:p>
+      <w:r>
+        <w:t>Agenda</w:t>
+      </w:r>
+    </w:p>
+    <w:p>
+      <w:r>
+        <w:t>Review basic calculator functions</w:t>
+      </w:r>
+    </w:p>
+    <w:p>
+      <w:r>
+        <w:t>Add scientific calculator functions</w:t>
+      </w:r>
+    </w:p>
+    <w:p>
+      <w:r>
+        <w:t>Improve error handing</w:t>
+      </w:r>
+    </w:p>
+    <w:p>
+      <w:r>
+        <w:t>Test the calculator</w:t>
+      </w:r>
+    </w:p>
+    <w:p/>
+    <w:p>
+      <w:r>
+        <w:t>Discussion Point</w:t>
+      </w:r>
+    </w:p>
+    <w:p/>
+    <w:p>
+      <w:r>
+        <w:t xml:space="preserve">New Functions </w:t>
+      </w:r>
+    </w:p>
+    <w:p>
+      <w:r>
+        <w:t>The group decided to add more advanced functions to make the calculator better. These include:</w:t>
+      </w:r>
+    </w:p>
+    <w:p>
+      <w:r>
+        <w:t>Square root</w:t>
+      </w:r>
+    </w:p>
+    <w:p>
+      <w:r>
+        <w:t>PI</w:t>
+      </w:r>
+    </w:p>
+    <w:p>
+      <w:r>
+        <w:t>Power function</w:t>
+      </w:r>
+    </w:p>
+    <w:p>
+      <w:r>
+        <w:t>Sine</w:t>
+      </w:r>
+    </w:p>
+    <w:p>
+      <w:r>
+        <w:t>Cosine</w:t>
+      </w:r>
+    </w:p>
+    <w:p>
+      <w:r>
+        <w:t>Tangent</w:t>
+      </w:r>
+    </w:p>
+    <w:p>
+      <w:r>
+        <w:t>Degree and radian mode</w:t>
+      </w:r>
+    </w:p>
+    <w:p/>
+    <w:p>
+      <w:r>
+        <w:t>Backend Logic</w:t>
+      </w:r>
+    </w:p>
+    <w:p>
+      <w:r>
+        <w:t>Simon worked on adding the scientific functions.</w:t>
+      </w:r>
+    </w:p>
+    <w:p>
+      <w:r>
+        <w:t xml:space="preserve">The math </w:t>
+      </w:r>
+      <w:r>
+        <w:t>module</w:t>
+      </w:r>
+      <w:r>
+        <w:t xml:space="preserve"> will be used for trigonometric </w:t>
+      </w:r>
+      <w:r>
+        <w:t xml:space="preserve">functions and </w:t>
+      </w:r>
+      <w:r>
+        <w:t xml:space="preserve">square </w:t>
+      </w:r>
+      <w:proofErr w:type="spellStart"/>
+      <w:r>
+        <w:t>roor</w:t>
+      </w:r>
+      <w:proofErr w:type="spellEnd"/>
+      <w:r>
+        <w:t>.</w:t>
+      </w:r>
+    </w:p>
+    <w:p/>
+    <w:p/>
+    <w:p/>
+    <w:p>
+      <w:r>
+        <w:t>The backend</w:t>
+      </w:r>
+      <w:r>
+        <w:t xml:space="preserve"> should handle </w:t>
+      </w:r>
+      <w:r>
+        <w:t xml:space="preserve">errors such as </w:t>
+      </w:r>
+      <w:r>
+        <w:t>:</w:t>
+      </w:r>
+    </w:p>
+    <w:p>
+      <w:r>
+        <w:t xml:space="preserve">Square root of </w:t>
+      </w:r>
+      <w:r>
+        <w:t xml:space="preserve">a </w:t>
+      </w:r>
+      <w:r>
+        <w:t xml:space="preserve">negative number </w:t>
+      </w:r>
+    </w:p>
+    <w:p>
+      <w:r>
+        <w:t xml:space="preserve">Invalid </w:t>
+      </w:r>
+      <w:r>
+        <w:t>formula</w:t>
+      </w:r>
+    </w:p>
+    <w:p>
+      <w:r>
+        <w:t xml:space="preserve">Missing </w:t>
+      </w:r>
+      <w:r>
+        <w:t>brackets</w:t>
+      </w:r>
+    </w:p>
+    <w:p>
+      <w:r>
+        <w:t xml:space="preserve">Division </w:t>
+      </w:r>
+      <w:r>
+        <w:t>by zero</w:t>
+      </w:r>
+    </w:p>
+    <w:p>
+      <w:r>
+        <w:t>GUI Improvements</w:t>
+      </w:r>
+    </w:p>
+    <w:tbl>
+      <w:tblPr>
+        <w:tblStyle w:val="TableGrid"/>
+        <w:tblW w:w="0" w:type="auto"/>
+        <w:tblLook w:val="06A0" w:firstRow="1" w:lastRow="0" w:firstColumn="1" w:lastColumn="0" w:noHBand="1" w:noVBand="1"/>
+      </w:tblPr>
+      <w:tblGrid>
+        <w:gridCol w:w="3435"/>
+      </w:tblGrid>
+      <w:tr>
+        <w:trPr>
+          <w:trHeight w:val="300"/>
+        </w:trPr>
+        <w:tc>
+          <w:tcPr>
+            <w:tcW w:w="3435" w:type="dxa"/>
+          </w:tcPr>
+          <w:p>
+            <w:r>
+              <w:t xml:space="preserve">Gareth </w:t>
+            </w:r>
+            <w:r>
+              <w:t xml:space="preserve">added new </w:t>
+            </w:r>
+            <w:r>
+              <w:t>buttons for:</w:t>
+            </w:r>
+          </w:p>
+        </w:tc>
+      </w:tr>
+      <w:tr>
+        <w:trPr>
+          <w:trHeight w:val="300"/>
+        </w:trPr>
+        <w:tc>
+          <w:tcPr>
+            <w:tcW w:w="3435" w:type="dxa"/>
+          </w:tcPr>
+          <w:p>
+            <w:r>
+              <w:t>sin</w:t>
+            </w:r>
+          </w:p>
+        </w:tc>
+      </w:tr>
+      <w:tr>
+        <w:trPr>
+          <w:trHeight w:val="300"/>
+        </w:trPr>
+        <w:tc>
+          <w:tcPr>
+            <w:tcW w:w="3435" w:type="dxa"/>
+          </w:tcPr>
+          <w:p>
+            <w:r>
+              <w:t>cos</w:t>
+            </w:r>
+          </w:p>
+        </w:tc>
+      </w:tr>
+      <w:tr>
+        <w:trPr>
+          <w:trHeight w:val="300"/>
+        </w:trPr>
+        <w:tc>
+          <w:tcPr>
+            <w:tcW w:w="3435" w:type="dxa"/>
+          </w:tcPr>
+          <w:p>
+            <w:r>
+              <w:t>tan</w:t>
+            </w:r>
+          </w:p>
+        </w:tc>
+      </w:tr>
+      <w:tr>
+        <w:trPr>
+          <w:trHeight w:val="300"/>
+        </w:trPr>
+        <w:tc>
+          <w:tcPr>
+            <w:tcW w:w="3435" w:type="dxa"/>
+          </w:tcPr>
+          <w:p>
+            <w:r>
+              <w:t>√</w:t>
+            </w:r>
+          </w:p>
+        </w:tc>
+      </w:tr>
+      <w:tr>
+        <w:trPr>
+          <w:trHeight w:val="300"/>
+        </w:trPr>
+        <w:tc>
+          <w:tcPr>
+            <w:tcW w:w="3435" w:type="dxa"/>
+          </w:tcPr>
+          <w:p>
+            <w:r>
+              <w:rPr>
+                <w:rFonts w:ascii="Aptos" w:eastAsia="Aptos" w:hAnsi="Aptos" w:cs="Aptos"/>
+              </w:rPr>
+              <w:t>π</w:t>
+            </w:r>
+          </w:p>
+        </w:tc>
+      </w:tr>
+      <w:tr>
+        <w:trPr>
+          <w:trHeight w:val="300"/>
+        </w:trPr>
+        <w:tc>
+          <w:tcPr>
+            <w:tcW w:w="3435" w:type="dxa"/>
+          </w:tcPr>
+          <w:p>
+            <w:r>
+              <w:t>DEG</w:t>
+            </w:r>
+            <w:r>
+              <w:t>/</w:t>
+            </w:r>
+            <w:r>
+              <w:t xml:space="preserve"> RAD</w:t>
+            </w:r>
+          </w:p>
+        </w:tc>
+      </w:tr>
+    </w:tbl>
+    <w:p>
+      <w:r>
+        <w:t xml:space="preserve">The layout was </w:t>
+      </w:r>
+      <w:r>
+        <w:t>adjusted to make the buttons easier to read.</w:t>
+      </w:r>
+    </w:p>
+    <w:p/>
+    <w:p/>
+    <w:p/>
+    <w:p/>
+    <w:p/>
+    <w:p/>
+    <w:p/>
+    <w:p/>
+    <w:p/>
+    <w:p/>
+    <w:p/>
+    <w:p/>
+    <w:p/>
+    <w:p>
       <w:r>
         <w:br/>
       </w:r>
@@ -145,141 +894,21 @@
         <w:br w:type="page"/>
       </w:r>
     </w:p>
+    <w:bookmarkEnd w:id="0"/>
+    <w:p>
+      <w:pPr>
+        <w:widowControl/>
+      </w:pPr>
+      <w:r>
+        <w:br w:type="page"/>
+      </w:r>
+    </w:p>
     <w:p>
       <w:pPr>
         <w:jc w:val="center"/>
       </w:pPr>
       <w:r>
-        <w:lastRenderedPageBreak/>
-        <w:t xml:space="preserve">Meeting Minutes </w:t>
-      </w:r>
-      <w:r>
-        <w:t>2</w:t>
-      </w:r>
-    </w:p>
-    <w:p>
-      <w:r>
-        <w:t xml:space="preserve">Date: </w:t>
-      </w:r>
-      <w:r>
-        <w:t>12</w:t>
-      </w:r>
-      <w:r>
-        <w:t>/5/2026</w:t>
-      </w:r>
-    </w:p>
-    <w:p>
-      <w:r>
-        <w:t xml:space="preserve">Attendees: Simon and Gareth </w:t>
-      </w:r>
-    </w:p>
-    <w:p>
-      <w:r>
-        <w:t xml:space="preserve">Aims: </w:t>
-      </w:r>
-      <w:r>
-        <w:t xml:space="preserve">discuss functions of the </w:t>
-      </w:r>
-      <w:r>
-        <w:t>calculator</w:t>
-      </w:r>
-      <w:r>
-        <w:t xml:space="preserve"> </w:t>
-      </w:r>
-      <w:r>
-        <w:t xml:space="preserve">backend </w:t>
-      </w:r>
-      <w:r>
-        <w:t xml:space="preserve">and </w:t>
-      </w:r>
-      <w:proofErr w:type="spellStart"/>
-      <w:r>
-        <w:t>tkinter</w:t>
-      </w:r>
-      <w:proofErr w:type="spellEnd"/>
-      <w:r>
-        <w:t xml:space="preserve"> </w:t>
-      </w:r>
-    </w:p>
-    <w:p/>
-    <w:p>
-      <w:r>
-        <w:t xml:space="preserve">Agenda: </w:t>
-      </w:r>
-    </w:p>
-    <w:p>
-      <w:r>
-        <w:tab/>
-      </w:r>
-    </w:p>
-    <w:p>
-      <w:r>
-        <w:t>Discussion points:</w:t>
-      </w:r>
-    </w:p>
-    <w:p>
-      <w:r>
-        <w:tab/>
-      </w:r>
-      <w:r>
-        <w:t>Calculator backend:</w:t>
-      </w:r>
-    </w:p>
-    <w:p>
-      <w:r>
-        <w:tab/>
-      </w:r>
-      <w:r>
-        <w:tab/>
-      </w:r>
-    </w:p>
-    <w:p>
-      <w:r>
-        <w:tab/>
-      </w:r>
-    </w:p>
-    <w:p/>
-    <w:p>
-      <w:r>
-        <w:t>Action items:</w:t>
-      </w:r>
-    </w:p>
-    <w:p>
-      <w:r>
-        <w:tab/>
-      </w:r>
-    </w:p>
-    <w:p/>
-    <w:p>
-      <w:r>
-        <w:t xml:space="preserve">Next meeting: </w:t>
-      </w:r>
-    </w:p>
-    <w:p>
-      <w:r>
-        <w:tab/>
-        <w:t xml:space="preserve">Goal: </w:t>
-      </w:r>
-    </w:p>
-    <w:bookmarkEnd w:id="0"/>
-    <w:p>
-      <w:pPr>
-        <w:widowControl/>
-      </w:pPr>
-      <w:r>
-        <w:br w:type="page"/>
-      </w:r>
-    </w:p>
-    <w:p>
-      <w:pPr>
-        <w:jc w:val="center"/>
-      </w:pPr>
-      <w:r>
-        <w:lastRenderedPageBreak/>
-        <w:t xml:space="preserve">Meeting Minutes </w:t>
-      </w:r>
-      <w:r>
-        <w:t>3</w:t>
+        <w:t>Meeting Minutes 3</w:t>
       </w:r>
     </w:p>
     <w:p>
@@ -1269,6 +1898,25 @@
       <w:spacing w:val="5"/>
     </w:rPr>
   </w:style>
+  <w:style w:type="table" w:styleId="TableGrid">
+    <w:name w:val="Table Grid"/>
+    <w:basedOn w:val="TableNormal"/>
+    <w:uiPriority w:val="59"/>
+    <w:rsid w:val="00920C7C"/>
+    <w:pPr>
+      <w:spacing w:after="0" w:line="240" w:lineRule="auto"/>
+    </w:pPr>
+    <w:tblPr>
+      <w:tblBorders>
+        <w:top w:val="single" w:sz="4" w:space="0" w:color="000000" w:themeColor="text1"/>
+        <w:left w:val="single" w:sz="4" w:space="0" w:color="000000" w:themeColor="text1"/>
+        <w:bottom w:val="single" w:sz="4" w:space="0" w:color="000000" w:themeColor="text1"/>
+        <w:right w:val="single" w:sz="4" w:space="0" w:color="000000" w:themeColor="text1"/>
+        <w:insideH w:val="single" w:sz="4" w:space="0" w:color="000000" w:themeColor="text1"/>
+        <w:insideV w:val="single" w:sz="4" w:space="0" w:color="000000" w:themeColor="text1"/>
+      </w:tblBorders>
+    </w:tblPr>
+  </w:style>
 </w:styles>
 </file>
 

</xml_diff>

<commit_message>
fix error with unit test
cannot be divide by 0, input of square root cannot be negative, range of inverse sin and cos should be -1 to 1
</commit_message>
<xml_diff>
--- a/Meeting Minutes.docx
+++ b/Meeting Minutes.docx
@@ -279,13 +279,31 @@
       </w:r>
     </w:p>
     <w:p>
-      <w:r>
+      <w:pPr>
+        <w:rPr>
+          <w:b/>
+          <w:bCs/>
+        </w:rPr>
+      </w:pPr>
+      <w:r>
+        <w:rPr>
+          <w:b/>
+          <w:bCs/>
+        </w:rPr>
         <w:t>Calculator Backend</w:t>
       </w:r>
       <w:r>
+        <w:rPr>
+          <w:b/>
+          <w:bCs/>
+        </w:rPr>
         <w:t xml:space="preserve"> operations: </w:t>
       </w:r>
       <w:r>
+        <w:rPr>
+          <w:b/>
+          <w:bCs/>
+        </w:rPr>
         <w:t>(Simon)</w:t>
       </w:r>
     </w:p>
@@ -309,35 +327,26 @@
         <w:t>Division</w:t>
       </w:r>
     </w:p>
-    <w:p>
-      <w:r>
-        <w:t>Error handing should be added to stop the program from crashing.</w:t>
-      </w:r>
-    </w:p>
-    <w:p>
-      <w:r>
-        <w:t>R</w:t>
-      </w:r>
-      <w:r>
-        <w:t>eturn an error message if the user divides by 0.</w:t>
-      </w:r>
-    </w:p>
-    <w:p/>
-    <w:p>
-      <w:proofErr w:type="spellStart"/>
-      <w:r>
-        <w:t>Tkinter</w:t>
-      </w:r>
-      <w:proofErr w:type="spellEnd"/>
-      <w:r>
-        <w:t xml:space="preserve"> GUI</w:t>
-      </w:r>
-    </w:p>
-    <w:p>
-      <w:r>
+    <w:p/>
+    <w:p>
+      <w:pPr>
+        <w:rPr>
+          <w:b/>
+          <w:bCs/>
+        </w:rPr>
+      </w:pPr>
+      <w:r>
+        <w:rPr>
+          <w:b/>
+          <w:bCs/>
+        </w:rPr>
         <w:t xml:space="preserve">The GUI </w:t>
       </w:r>
       <w:r>
+        <w:rPr>
+          <w:b/>
+          <w:bCs/>
+        </w:rPr>
         <w:t>functions: (Gareth)</w:t>
       </w:r>
     </w:p>
@@ -529,7 +538,7 @@
         <w:t>Goa</w:t>
       </w:r>
       <w:r>
-        <w:t>l: Add scientific functions such as square root and trigonometric functions.</w:t>
+        <w:t>l: Add scientific functions such as square root and trigonometric functions</w:t>
       </w:r>
     </w:p>
     <w:p/>
@@ -561,7 +570,19 @@
     </w:p>
     <w:p/>
     <w:p>
-      <w:r>
+      <w:pPr>
+        <w:rPr>
+          <w:b/>
+          <w:bCs/>
+          <w:u w:val="single"/>
+        </w:rPr>
+      </w:pPr>
+      <w:r>
+        <w:rPr>
+          <w:b/>
+          <w:bCs/>
+          <w:u w:val="single"/>
+        </w:rPr>
         <w:t>Agenda</w:t>
       </w:r>
     </w:p>
@@ -577,7 +598,7 @@
     </w:p>
     <w:p>
       <w:r>
-        <w:t>Improve error handing</w:t>
+        <w:t>Fix error</w:t>
       </w:r>
     </w:p>
     <w:p>
@@ -587,20 +608,96 @@
     </w:p>
     <w:p/>
     <w:p>
-      <w:r>
+      <w:pPr>
+        <w:rPr>
+          <w:b/>
+          <w:bCs/>
+          <w:u w:val="single"/>
+        </w:rPr>
+      </w:pPr>
+      <w:r>
+        <w:rPr>
+          <w:b/>
+          <w:bCs/>
+          <w:u w:val="single"/>
+        </w:rPr>
         <w:t>Discussion Point</w:t>
       </w:r>
     </w:p>
-    <w:p/>
-    <w:p>
-      <w:r>
+    <w:p>
+      <w:pPr>
+        <w:rPr>
+          <w:b/>
+          <w:bCs/>
+          <w:u w:val="single"/>
+        </w:rPr>
+      </w:pPr>
+      <w:r>
+        <w:rPr>
+          <w:b/>
+          <w:bCs/>
+          <w:u w:val="single"/>
+        </w:rPr>
+        <w:t>Unit Test</w:t>
+      </w:r>
+    </w:p>
+    <w:p>
+      <w:r>
+        <w:t xml:space="preserve">Input of </w:t>
+      </w:r>
+      <w:r>
+        <w:t xml:space="preserve">inverse </w:t>
+      </w:r>
+      <w:r>
+        <w:t xml:space="preserve">sin and cos should be within 1 to -1 </w:t>
+      </w:r>
+    </w:p>
+    <w:p>
+      <w:r>
+        <w:t>Return an error message if divide by 0</w:t>
+      </w:r>
+    </w:p>
+    <w:p>
+      <w:r>
+        <w:t xml:space="preserve">Input of square root cannot be negative </w:t>
+      </w:r>
+    </w:p>
+    <w:p/>
+    <w:p>
+      <w:pPr>
+        <w:rPr>
+          <w:b/>
+          <w:bCs/>
+          <w:u w:val="single"/>
+        </w:rPr>
+      </w:pPr>
+      <w:r>
+        <w:rPr>
+          <w:b/>
+          <w:bCs/>
+          <w:u w:val="single"/>
+        </w:rPr>
         <w:t xml:space="preserve">New Functions </w:t>
       </w:r>
     </w:p>
     <w:p>
       <w:r>
-        <w:t>The group decided to add more advanced functions to make the calculator better. These include:</w:t>
-      </w:r>
+        <w:t>A</w:t>
+      </w:r>
+      <w:r>
+        <w:t xml:space="preserve">dd more functions to </w:t>
+      </w:r>
+      <w:r>
+        <w:t xml:space="preserve">the </w:t>
+      </w:r>
+      <w:proofErr w:type="gramStart"/>
+      <w:r>
+        <w:t xml:space="preserve">calculator </w:t>
+      </w:r>
+      <w:r>
+        <w:t>:</w:t>
+      </w:r>
+      <w:proofErr w:type="gramEnd"/>
     </w:p>
     <w:p>
       <w:r>
@@ -609,7 +706,7 @@
     </w:p>
     <w:p>
       <w:r>
-        <w:t>PI</w:t>
+        <w:t>π</w:t>
       </w:r>
     </w:p>
     <w:p>
@@ -638,93 +735,7 @@
       </w:r>
     </w:p>
     <w:p/>
-    <w:p>
-      <w:r>
-        <w:t>Backend Logic</w:t>
-      </w:r>
-    </w:p>
-    <w:p>
-      <w:r>
-        <w:t>Simon worked on adding the scientific functions.</w:t>
-      </w:r>
-    </w:p>
-    <w:p>
-      <w:r>
-        <w:t xml:space="preserve">The math </w:t>
-      </w:r>
-      <w:r>
-        <w:t>module</w:t>
-      </w:r>
-      <w:r>
-        <w:t xml:space="preserve"> will be used for trigonometric </w:t>
-      </w:r>
-      <w:r>
-        <w:t xml:space="preserve">functions and </w:t>
-      </w:r>
-      <w:r>
-        <w:t xml:space="preserve">square </w:t>
-      </w:r>
-      <w:proofErr w:type="spellStart"/>
-      <w:r>
-        <w:t>roor</w:t>
-      </w:r>
-      <w:proofErr w:type="spellEnd"/>
-      <w:r>
-        <w:t>.</w:t>
-      </w:r>
-    </w:p>
-    <w:p/>
-    <w:p/>
-    <w:p/>
-    <w:p>
-      <w:r>
-        <w:t>The backend</w:t>
-      </w:r>
-      <w:r>
-        <w:t xml:space="preserve"> should handle </w:t>
-      </w:r>
-      <w:r>
-        <w:t xml:space="preserve">errors such as </w:t>
-      </w:r>
-      <w:r>
-        <w:t>:</w:t>
-      </w:r>
-    </w:p>
-    <w:p>
-      <w:r>
-        <w:t xml:space="preserve">Square root of </w:t>
-      </w:r>
-      <w:r>
-        <w:t xml:space="preserve">a </w:t>
-      </w:r>
-      <w:r>
-        <w:t xml:space="preserve">negative number </w:t>
-      </w:r>
-    </w:p>
-    <w:p>
-      <w:r>
-        <w:t xml:space="preserve">Invalid </w:t>
-      </w:r>
-      <w:r>
-        <w:t>formula</w:t>
-      </w:r>
-    </w:p>
-    <w:p>
-      <w:r>
-        <w:t xml:space="preserve">Missing </w:t>
-      </w:r>
-      <w:r>
-        <w:t>brackets</w:t>
-      </w:r>
-    </w:p>
-    <w:p>
-      <w:r>
-        <w:t xml:space="preserve">Division </w:t>
-      </w:r>
-      <w:r>
-        <w:t>by zero</w:t>
-      </w:r>
-    </w:p>
+    <w:p/>
     <w:p>
       <w:r>
         <w:t>GUI Improvements</w:t>
@@ -862,16 +873,1113 @@
     </w:tbl>
     <w:p>
       <w:r>
-        <w:t xml:space="preserve">The layout was </w:t>
-      </w:r>
-      <w:r>
-        <w:t>adjusted to make the buttons easier to read.</w:t>
-      </w:r>
-    </w:p>
-    <w:p/>
-    <w:p/>
-    <w:p/>
-    <w:p/>
+        <w:t>Change t</w:t>
+      </w:r>
+      <w:r>
+        <w:t xml:space="preserve">he layout </w:t>
+      </w:r>
+      <w:r>
+        <w:t>for easier to use</w:t>
+      </w:r>
+    </w:p>
+    <w:p/>
+    <w:p>
+      <w:r>
+        <w:t>Action Items</w:t>
+      </w:r>
+    </w:p>
+    <w:tbl>
+      <w:tblPr>
+        <w:tblStyle w:val="TableGrid"/>
+        <w:tblW w:w="0" w:type="auto"/>
+        <w:tblLook w:val="06A0" w:firstRow="1" w:lastRow="0" w:firstColumn="1" w:lastColumn="0" w:noHBand="1" w:noVBand="1"/>
+      </w:tblPr>
+      <w:tblGrid>
+        <w:gridCol w:w="4148"/>
+        <w:gridCol w:w="4148"/>
+      </w:tblGrid>
+      <w:tr>
+        <w:trPr>
+          <w:trHeight w:val="300"/>
+        </w:trPr>
+        <w:tc>
+          <w:tcPr>
+            <w:tcW w:w="4148" w:type="dxa"/>
+          </w:tcPr>
+          <w:p>
+            <w:r>
+              <w:t>Task</w:t>
+            </w:r>
+          </w:p>
+        </w:tc>
+        <w:tc>
+          <w:tcPr>
+            <w:tcW w:w="4148" w:type="dxa"/>
+          </w:tcPr>
+          <w:p>
+            <w:r>
+              <w:t>Person Responsible</w:t>
+            </w:r>
+          </w:p>
+        </w:tc>
+      </w:tr>
+      <w:tr>
+        <w:trPr>
+          <w:trHeight w:val="300"/>
+        </w:trPr>
+        <w:tc>
+          <w:tcPr>
+            <w:tcW w:w="4148" w:type="dxa"/>
+          </w:tcPr>
+          <w:p>
+            <w:r>
+              <w:t>Add square root and pi functions</w:t>
+            </w:r>
+          </w:p>
+        </w:tc>
+        <w:tc>
+          <w:tcPr>
+            <w:tcW w:w="4148" w:type="dxa"/>
+          </w:tcPr>
+          <w:p>
+            <w:r>
+              <w:t>Simon</w:t>
+            </w:r>
+          </w:p>
+        </w:tc>
+      </w:tr>
+      <w:tr>
+        <w:trPr>
+          <w:trHeight w:val="300"/>
+        </w:trPr>
+        <w:tc>
+          <w:tcPr>
+            <w:tcW w:w="4148" w:type="dxa"/>
+          </w:tcPr>
+          <w:p>
+            <w:r>
+              <w:t>Add sin, cos and tan functions</w:t>
+            </w:r>
+          </w:p>
+        </w:tc>
+        <w:tc>
+          <w:tcPr>
+            <w:tcW w:w="4148" w:type="dxa"/>
+          </w:tcPr>
+          <w:p>
+            <w:r>
+              <w:t>Simon</w:t>
+            </w:r>
+          </w:p>
+        </w:tc>
+      </w:tr>
+      <w:tr>
+        <w:trPr>
+          <w:trHeight w:val="300"/>
+        </w:trPr>
+        <w:tc>
+          <w:tcPr>
+            <w:tcW w:w="4148" w:type="dxa"/>
+          </w:tcPr>
+          <w:p>
+            <w:r>
+              <w:t>Add scientific buttons to GUI</w:t>
+            </w:r>
+          </w:p>
+        </w:tc>
+        <w:tc>
+          <w:tcPr>
+            <w:tcW w:w="4148" w:type="dxa"/>
+          </w:tcPr>
+          <w:p>
+            <w:r>
+              <w:t>Gareth</w:t>
+            </w:r>
+          </w:p>
+        </w:tc>
+      </w:tr>
+      <w:tr>
+        <w:trPr>
+          <w:trHeight w:val="300"/>
+        </w:trPr>
+        <w:tc>
+          <w:tcPr>
+            <w:tcW w:w="4148" w:type="dxa"/>
+          </w:tcPr>
+          <w:p>
+            <w:r>
+              <w:t>Test scientific calculator functions</w:t>
+            </w:r>
+          </w:p>
+        </w:tc>
+        <w:tc>
+          <w:tcPr>
+            <w:tcW w:w="4148" w:type="dxa"/>
+          </w:tcPr>
+          <w:p>
+            <w:r>
+              <w:t>Simon and Gareth</w:t>
+            </w:r>
+          </w:p>
+        </w:tc>
+      </w:tr>
+      <w:tr>
+        <w:trPr>
+          <w:trHeight w:val="300"/>
+        </w:trPr>
+        <w:tc>
+          <w:tcPr>
+            <w:tcW w:w="4148" w:type="dxa"/>
+          </w:tcPr>
+          <w:p>
+            <w:r>
+              <w:t>Fix layout problems</w:t>
+            </w:r>
+          </w:p>
+        </w:tc>
+        <w:tc>
+          <w:tcPr>
+            <w:tcW w:w="4148" w:type="dxa"/>
+          </w:tcPr>
+          <w:p>
+            <w:r>
+              <w:t>Gareth</w:t>
+            </w:r>
+          </w:p>
+        </w:tc>
+      </w:tr>
+    </w:tbl>
+    <w:p/>
+    <w:p>
+      <w:r>
+        <w:t>Next Meeting</w:t>
+      </w:r>
+    </w:p>
+    <w:p>
+      <w:r>
+        <w:t>Date: 26/5/2026</w:t>
+      </w:r>
+    </w:p>
+    <w:p>
+      <w:r>
+        <w:t xml:space="preserve">Goal: Final testing, documentation </w:t>
+      </w:r>
+      <w:r>
+        <w:t>and project checking.</w:t>
+      </w:r>
+    </w:p>
+    <w:p/>
+    <w:p/>
+    <w:p/>
+    <w:p/>
+    <w:p>
+      <w:r>
+        <w:t xml:space="preserve">Meeting </w:t>
+      </w:r>
+      <w:r>
+        <w:t>Minutes 4</w:t>
+      </w:r>
+    </w:p>
+    <w:p>
+      <w:r>
+        <w:t xml:space="preserve">Date: </w:t>
+      </w:r>
+      <w:r>
+        <w:t>26/5/2026</w:t>
+      </w:r>
+    </w:p>
+    <w:p>
+      <w:r>
+        <w:t>Attendees: Simon and Gareth</w:t>
+      </w:r>
+    </w:p>
+    <w:p>
+      <w:r>
+        <w:t>Aims: Complete final</w:t>
+      </w:r>
+      <w:r>
+        <w:t xml:space="preserve"> testing and prepare </w:t>
+      </w:r>
+      <w:r>
+        <w:t>project documentation</w:t>
+      </w:r>
+    </w:p>
+    <w:p/>
+    <w:p>
+      <w:r>
+        <w:t xml:space="preserve">Agenda </w:t>
+      </w:r>
+    </w:p>
+    <w:p>
+      <w:r>
+        <w:t>Dinal check of calculator functions</w:t>
+      </w:r>
+    </w:p>
+    <w:p>
+      <w:r>
+        <w:t>Test the GUI</w:t>
+      </w:r>
+    </w:p>
+    <w:p>
+      <w:r>
+        <w:t>Record testing evidence Prepare documentation</w:t>
+      </w:r>
+    </w:p>
+    <w:p>
+      <w:r>
+        <w:t>Discuss final submission</w:t>
+      </w:r>
+    </w:p>
+    <w:p/>
+    <w:p>
+      <w:r>
+        <w:t>Discussion</w:t>
+      </w:r>
+      <w:r>
+        <w:t xml:space="preserve"> Points</w:t>
+      </w:r>
+    </w:p>
+    <w:p/>
+    <w:p>
+      <w:r>
+        <w:t>Testing</w:t>
+      </w:r>
+    </w:p>
+    <w:p>
+      <w:r>
+        <w:t xml:space="preserve">The group tested the main </w:t>
+      </w:r>
+      <w:r>
+        <w:t xml:space="preserve">calculator </w:t>
+      </w:r>
+      <w:r>
+        <w:t>functions, including:</w:t>
+      </w:r>
+    </w:p>
+    <w:p>
+      <w:r>
+        <w:t>Basic calculations</w:t>
+      </w:r>
+    </w:p>
+    <w:p>
+      <w:r>
+        <w:t>Decimal calculations</w:t>
+      </w:r>
+    </w:p>
+    <w:p>
+      <w:r>
+        <w:t>Brackets</w:t>
+      </w:r>
+    </w:p>
+    <w:p>
+      <w:r>
+        <w:t>Square root</w:t>
+      </w:r>
+    </w:p>
+    <w:p>
+      <w:r>
+        <w:t xml:space="preserve">Square </w:t>
+      </w:r>
+      <w:r>
+        <w:t>root</w:t>
+      </w:r>
+    </w:p>
+    <w:p>
+      <w:r>
+        <w:t>PI</w:t>
+      </w:r>
+    </w:p>
+    <w:p>
+      <w:r>
+        <w:t>Power</w:t>
+      </w:r>
+      <w:r>
+        <w:t xml:space="preserve"> function</w:t>
+      </w:r>
+    </w:p>
+    <w:p>
+      <w:r>
+        <w:t>Sine, cosine and tangent</w:t>
+      </w:r>
+    </w:p>
+    <w:p>
+      <w:r>
+        <w:t xml:space="preserve">Degree and </w:t>
+      </w:r>
+      <w:r>
+        <w:t>radian mode</w:t>
+      </w:r>
+    </w:p>
+    <w:p>
+      <w:r>
+        <w:t>Error handing</w:t>
+      </w:r>
+    </w:p>
+    <w:p/>
+    <w:p>
+      <w:r>
+        <w:t xml:space="preserve">Errors </w:t>
+      </w:r>
+      <w:r>
+        <w:t>Found</w:t>
+      </w:r>
+    </w:p>
+    <w:p>
+      <w:r>
+        <w:t xml:space="preserve">Some errors were found </w:t>
+      </w:r>
+      <w:r>
+        <w:t>during</w:t>
+      </w:r>
+      <w:r>
+        <w:t xml:space="preserve"> testing</w:t>
+      </w:r>
+      <w:r>
+        <w:t>:</w:t>
+      </w:r>
+    </w:p>
+    <w:p>
+      <w:r>
+        <w:t xml:space="preserve">The calculator showed </w:t>
+      </w:r>
+      <w:r>
+        <w:t xml:space="preserve">an error when </w:t>
+      </w:r>
+      <w:r>
+        <w:t>brackets were missing.</w:t>
+      </w:r>
+    </w:p>
+    <w:p>
+      <w:r>
+        <w:t>Dividing by</w:t>
+      </w:r>
+      <w:r>
+        <w:t xml:space="preserve"> </w:t>
+      </w:r>
+      <w:r>
+        <w:t>0</w:t>
+      </w:r>
+      <w:r>
+        <w:t xml:space="preserve"> </w:t>
+      </w:r>
+      <w:proofErr w:type="gramStart"/>
+      <w:r>
+        <w:t>showed  an</w:t>
+      </w:r>
+      <w:proofErr w:type="gramEnd"/>
+      <w:r>
+        <w:t xml:space="preserve"> </w:t>
+      </w:r>
+      <w:r>
+        <w:t xml:space="preserve">error </w:t>
+      </w:r>
+      <w:r>
+        <w:t>message.</w:t>
+      </w:r>
+    </w:p>
+    <w:p>
+      <w:r>
+        <w:t>Square root of a negative number showed an error message.</w:t>
+      </w:r>
+    </w:p>
+    <w:p>
+      <w:r>
+        <w:t>Some button layout spacing needed</w:t>
+      </w:r>
+      <w:r>
+        <w:t xml:space="preserve"> </w:t>
+      </w:r>
+      <w:proofErr w:type="gramStart"/>
+      <w:r>
+        <w:t xml:space="preserve">improvement </w:t>
+      </w:r>
+      <w:r>
+        <w:t>.</w:t>
+      </w:r>
+      <w:proofErr w:type="gramEnd"/>
+    </w:p>
+    <w:p/>
+    <w:p>
+      <w:r>
+        <w:t>Fixes</w:t>
+      </w:r>
+    </w:p>
+    <w:p>
+      <w:r>
+        <w:t xml:space="preserve">Simon improved the </w:t>
+      </w:r>
+      <w:r>
+        <w:t xml:space="preserve">backend error </w:t>
+      </w:r>
+      <w:r>
+        <w:t>handling.</w:t>
+      </w:r>
+    </w:p>
+    <w:p>
+      <w:r>
+        <w:t xml:space="preserve">Gareth adjusted the GUI </w:t>
+      </w:r>
+      <w:r>
+        <w:t>layout.</w:t>
+      </w:r>
+    </w:p>
+    <w:p>
+      <w:r>
+        <w:t>Both members tested the final version again</w:t>
+      </w:r>
+      <w:r>
+        <w:t>.</w:t>
+      </w:r>
+    </w:p>
+    <w:p/>
+    <w:p>
+      <w:r>
+        <w:t>Action</w:t>
+      </w:r>
+      <w:r>
+        <w:t xml:space="preserve"> Items</w:t>
+      </w:r>
+    </w:p>
+    <w:tbl>
+      <w:tblPr>
+        <w:tblStyle w:val="TableGrid"/>
+        <w:tblW w:w="0" w:type="auto"/>
+        <w:tblLook w:val="06A0" w:firstRow="1" w:lastRow="0" w:firstColumn="1" w:lastColumn="0" w:noHBand="1" w:noVBand="1"/>
+      </w:tblPr>
+      <w:tblGrid>
+        <w:gridCol w:w="4148"/>
+        <w:gridCol w:w="4148"/>
+      </w:tblGrid>
+      <w:tr>
+        <w:trPr>
+          <w:trHeight w:val="300"/>
+        </w:trPr>
+        <w:tc>
+          <w:tcPr>
+            <w:tcW w:w="4148" w:type="dxa"/>
+          </w:tcPr>
+          <w:p>
+            <w:r>
+              <w:t>Task</w:t>
+            </w:r>
+          </w:p>
+        </w:tc>
+        <w:tc>
+          <w:tcPr>
+            <w:tcW w:w="4148" w:type="dxa"/>
+          </w:tcPr>
+          <w:p>
+            <w:r>
+              <w:t xml:space="preserve">Person </w:t>
+            </w:r>
+            <w:r>
+              <w:t>Responsible</w:t>
+            </w:r>
+          </w:p>
+        </w:tc>
+      </w:tr>
+      <w:tr>
+        <w:trPr>
+          <w:trHeight w:val="300"/>
+        </w:trPr>
+        <w:tc>
+          <w:tcPr>
+            <w:tcW w:w="4148" w:type="dxa"/>
+          </w:tcPr>
+          <w:p>
+            <w:r>
+              <w:t xml:space="preserve">Complete final backend </w:t>
+            </w:r>
+            <w:r>
+              <w:t>fixes</w:t>
+            </w:r>
+          </w:p>
+        </w:tc>
+        <w:tc>
+          <w:tcPr>
+            <w:tcW w:w="4148" w:type="dxa"/>
+          </w:tcPr>
+          <w:p>
+            <w:r>
+              <w:t xml:space="preserve">Simon </w:t>
+            </w:r>
+          </w:p>
+        </w:tc>
+      </w:tr>
+      <w:tr>
+        <w:trPr>
+          <w:trHeight w:val="300"/>
+        </w:trPr>
+        <w:tc>
+          <w:tcPr>
+            <w:tcW w:w="4148" w:type="dxa"/>
+          </w:tcPr>
+          <w:p>
+            <w:r>
+              <w:t xml:space="preserve">Complete final GUI </w:t>
+            </w:r>
+            <w:r>
+              <w:t>fixes</w:t>
+            </w:r>
+          </w:p>
+        </w:tc>
+        <w:tc>
+          <w:tcPr>
+            <w:tcW w:w="4148" w:type="dxa"/>
+          </w:tcPr>
+          <w:p>
+            <w:r>
+              <w:t>Gareth</w:t>
+            </w:r>
+          </w:p>
+        </w:tc>
+      </w:tr>
+      <w:tr>
+        <w:trPr>
+          <w:trHeight w:val="300"/>
+        </w:trPr>
+        <w:tc>
+          <w:tcPr>
+            <w:tcW w:w="4148" w:type="dxa"/>
+          </w:tcPr>
+          <w:p>
+            <w:r>
+              <w:t>Create testing evidence table</w:t>
+            </w:r>
+          </w:p>
+        </w:tc>
+        <w:tc>
+          <w:tcPr>
+            <w:tcW w:w="4148" w:type="dxa"/>
+          </w:tcPr>
+          <w:p>
+            <w:r>
+              <w:t>Simon and Gareth</w:t>
+            </w:r>
+          </w:p>
+        </w:tc>
+      </w:tr>
+      <w:tr>
+        <w:trPr>
+          <w:trHeight w:val="300"/>
+        </w:trPr>
+        <w:tc>
+          <w:tcPr>
+            <w:tcW w:w="4148" w:type="dxa"/>
+          </w:tcPr>
+          <w:p>
+            <w:r>
+              <w:t xml:space="preserve">Write project </w:t>
+            </w:r>
+            <w:r>
+              <w:t>documentation</w:t>
+            </w:r>
+          </w:p>
+        </w:tc>
+        <w:tc>
+          <w:tcPr>
+            <w:tcW w:w="4148" w:type="dxa"/>
+          </w:tcPr>
+          <w:p>
+            <w:r>
+              <w:t xml:space="preserve">Simon and </w:t>
+            </w:r>
+            <w:r>
+              <w:t>Gareth</w:t>
+            </w:r>
+          </w:p>
+        </w:tc>
+      </w:tr>
+      <w:tr>
+        <w:trPr>
+          <w:trHeight w:val="300"/>
+        </w:trPr>
+        <w:tc>
+          <w:tcPr>
+            <w:tcW w:w="4148" w:type="dxa"/>
+          </w:tcPr>
+          <w:p>
+            <w:r>
+              <w:t xml:space="preserve">Final check before </w:t>
+            </w:r>
+            <w:r>
+              <w:t>submission</w:t>
+            </w:r>
+          </w:p>
+        </w:tc>
+        <w:tc>
+          <w:tcPr>
+            <w:tcW w:w="4148" w:type="dxa"/>
+          </w:tcPr>
+          <w:p>
+            <w:r>
+              <w:t>Simon and Gareth</w:t>
+            </w:r>
+          </w:p>
+        </w:tc>
+      </w:tr>
+    </w:tbl>
+    <w:p>
+      <w:proofErr w:type="gramStart"/>
+      <w:r>
+        <w:t>Final Outcome</w:t>
+      </w:r>
+      <w:proofErr w:type="gramEnd"/>
+    </w:p>
+    <w:p>
+      <w:r>
+        <w:t xml:space="preserve">The calculator project was completed. </w:t>
+      </w:r>
+      <w:r>
+        <w:t xml:space="preserve">The program includes a </w:t>
+      </w:r>
+      <w:proofErr w:type="spellStart"/>
+      <w:r>
+        <w:t>Tkinter</w:t>
+      </w:r>
+      <w:proofErr w:type="spellEnd"/>
+      <w:r>
+        <w:t xml:space="preserve"> GUI, basic calculator functions, </w:t>
+      </w:r>
+      <w:r>
+        <w:t>scientific functions and error handing.</w:t>
+      </w:r>
+    </w:p>
+    <w:p/>
+    <w:p/>
+    <w:p/>
+    <w:p/>
+    <w:p/>
+    <w:p/>
+    <w:p/>
+    <w:tbl>
+      <w:tblPr>
+        <w:tblStyle w:val="TableGrid"/>
+        <w:tblW w:w="0" w:type="auto"/>
+        <w:tblLook w:val="06A0" w:firstRow="1" w:lastRow="0" w:firstColumn="1" w:lastColumn="0" w:noHBand="1" w:noVBand="1"/>
+      </w:tblPr>
+      <w:tblGrid>
+        <w:gridCol w:w="943"/>
+        <w:gridCol w:w="650"/>
+        <w:gridCol w:w="1616"/>
+        <w:gridCol w:w="1342"/>
+        <w:gridCol w:w="1050"/>
+        <w:gridCol w:w="1079"/>
+        <w:gridCol w:w="1616"/>
+      </w:tblGrid>
+      <w:tr>
+        <w:trPr>
+          <w:trHeight w:val="300"/>
+        </w:trPr>
+        <w:tc>
+          <w:tcPr>
+            <w:tcW w:w="1185" w:type="dxa"/>
+          </w:tcPr>
+          <w:p>
+            <w:r>
+              <w:t>Meeting</w:t>
+            </w:r>
+          </w:p>
+        </w:tc>
+        <w:tc>
+          <w:tcPr>
+            <w:tcW w:w="1185" w:type="dxa"/>
+          </w:tcPr>
+          <w:p>
+            <w:r>
+              <w:t>Date</w:t>
+            </w:r>
+          </w:p>
+        </w:tc>
+        <w:tc>
+          <w:tcPr>
+            <w:tcW w:w="1185" w:type="dxa"/>
+          </w:tcPr>
+          <w:p>
+            <w:r>
+              <w:t>Main Aim</w:t>
+            </w:r>
+          </w:p>
+        </w:tc>
+        <w:tc>
+          <w:tcPr>
+            <w:tcW w:w="1185" w:type="dxa"/>
+          </w:tcPr>
+          <w:p>
+            <w:r>
+              <w:t>Simon’s Task</w:t>
+            </w:r>
+          </w:p>
+        </w:tc>
+        <w:tc>
+          <w:tcPr>
+            <w:tcW w:w="1185" w:type="dxa"/>
+          </w:tcPr>
+          <w:p>
+            <w:r>
+              <w:t>Gareth’s</w:t>
+            </w:r>
+            <w:r>
+              <w:t xml:space="preserve"> Task</w:t>
+            </w:r>
+          </w:p>
+        </w:tc>
+        <w:tc>
+          <w:tcPr>
+            <w:tcW w:w="1185" w:type="dxa"/>
+          </w:tcPr>
+          <w:p>
+            <w:r>
+              <w:t>Group Task</w:t>
+            </w:r>
+          </w:p>
+        </w:tc>
+        <w:tc>
+          <w:tcPr>
+            <w:tcW w:w="1298" w:type="dxa"/>
+          </w:tcPr>
+          <w:p>
+            <w:r>
+              <w:t xml:space="preserve">Next </w:t>
+            </w:r>
+            <w:r>
+              <w:t>Goal</w:t>
+            </w:r>
+          </w:p>
+        </w:tc>
+      </w:tr>
+      <w:tr>
+        <w:trPr>
+          <w:trHeight w:val="300"/>
+        </w:trPr>
+        <w:tc>
+          <w:tcPr>
+            <w:tcW w:w="1185" w:type="dxa"/>
+          </w:tcPr>
+          <w:p>
+            <w:r>
+              <w:t>Meeting 1</w:t>
+            </w:r>
+          </w:p>
+        </w:tc>
+        <w:tc>
+          <w:tcPr>
+            <w:tcW w:w="1185" w:type="dxa"/>
+          </w:tcPr>
+          <w:p/>
+        </w:tc>
+        <w:tc>
+          <w:tcPr>
+            <w:tcW w:w="1185" w:type="dxa"/>
+          </w:tcPr>
+          <w:p>
+            <w:r>
+              <w:t xml:space="preserve">Divide project </w:t>
+            </w:r>
+            <w:r>
+              <w:t>tasks</w:t>
+            </w:r>
+          </w:p>
+        </w:tc>
+        <w:tc>
+          <w:tcPr>
+            <w:tcW w:w="1185" w:type="dxa"/>
+          </w:tcPr>
+          <w:p>
+            <w:r>
+              <w:t xml:space="preserve">Backend </w:t>
+            </w:r>
+            <w:r>
+              <w:t>planning</w:t>
+            </w:r>
+          </w:p>
+        </w:tc>
+        <w:tc>
+          <w:tcPr>
+            <w:tcW w:w="1185" w:type="dxa"/>
+          </w:tcPr>
+          <w:p>
+            <w:r>
+              <w:t>GUI planning</w:t>
+            </w:r>
+          </w:p>
+        </w:tc>
+        <w:tc>
+          <w:tcPr>
+            <w:tcW w:w="1185" w:type="dxa"/>
+          </w:tcPr>
+          <w:p>
+            <w:r>
+              <w:t>Discuss project idea and possible errors</w:t>
+            </w:r>
+          </w:p>
+        </w:tc>
+        <w:tc>
+          <w:tcPr>
+            <w:tcW w:w="1298" w:type="dxa"/>
+          </w:tcPr>
+          <w:p>
+            <w:r>
+              <w:t>Basic interfac</w:t>
+            </w:r>
+            <w:r>
+              <w:t>e and simple functions</w:t>
+            </w:r>
+          </w:p>
+        </w:tc>
+      </w:tr>
+      <w:tr>
+        <w:trPr>
+          <w:trHeight w:val="300"/>
+        </w:trPr>
+        <w:tc>
+          <w:tcPr>
+            <w:tcW w:w="1185" w:type="dxa"/>
+          </w:tcPr>
+          <w:p>
+            <w:r>
+              <w:t>Meeting 2</w:t>
+            </w:r>
+          </w:p>
+        </w:tc>
+        <w:tc>
+          <w:tcPr>
+            <w:tcW w:w="1185" w:type="dxa"/>
+          </w:tcPr>
+          <w:p/>
+        </w:tc>
+        <w:tc>
+          <w:tcPr>
+            <w:tcW w:w="1185" w:type="dxa"/>
+          </w:tcPr>
+          <w:p>
+            <w:r>
+              <w:t xml:space="preserve">Discuss backend and </w:t>
+            </w:r>
+            <w:proofErr w:type="gramStart"/>
+            <w:r>
+              <w:t xml:space="preserve">GUI  </w:t>
+            </w:r>
+            <w:r>
+              <w:t>Progress</w:t>
+            </w:r>
+            <w:proofErr w:type="gramEnd"/>
+          </w:p>
+        </w:tc>
+        <w:tc>
+          <w:tcPr>
+            <w:tcW w:w="1185" w:type="dxa"/>
+          </w:tcPr>
+          <w:p>
+            <w:r>
+              <w:t xml:space="preserve">Basic </w:t>
+            </w:r>
+            <w:proofErr w:type="gramStart"/>
+            <w:r>
+              <w:t xml:space="preserve">calculations </w:t>
+            </w:r>
+            <w:r>
+              <w:t xml:space="preserve"> </w:t>
+            </w:r>
+            <w:r>
+              <w:t>functions</w:t>
+            </w:r>
+            <w:proofErr w:type="gramEnd"/>
+          </w:p>
+          <w:p/>
+        </w:tc>
+        <w:tc>
+          <w:tcPr>
+            <w:tcW w:w="1185" w:type="dxa"/>
+          </w:tcPr>
+          <w:p>
+            <w:proofErr w:type="spellStart"/>
+            <w:r>
+              <w:t>Tkinter</w:t>
+            </w:r>
+            <w:proofErr w:type="spellEnd"/>
+            <w:r>
+              <w:t xml:space="preserve"> layout and buttons</w:t>
+            </w:r>
+          </w:p>
+        </w:tc>
+        <w:tc>
+          <w:tcPr>
+            <w:tcW w:w="1185" w:type="dxa"/>
+          </w:tcPr>
+          <w:p>
+            <w:r>
+              <w:t>Connect GUI with backend</w:t>
+            </w:r>
+          </w:p>
+        </w:tc>
+        <w:tc>
+          <w:tcPr>
+            <w:tcW w:w="1298" w:type="dxa"/>
+          </w:tcPr>
+          <w:p>
+            <w:r>
+              <w:t>Add scientific functions</w:t>
+            </w:r>
+          </w:p>
+        </w:tc>
+      </w:tr>
+      <w:tr>
+        <w:trPr>
+          <w:trHeight w:val="300"/>
+        </w:trPr>
+        <w:tc>
+          <w:tcPr>
+            <w:tcW w:w="1185" w:type="dxa"/>
+          </w:tcPr>
+          <w:p>
+            <w:r>
+              <w:t>Meeting 3</w:t>
+            </w:r>
+          </w:p>
+        </w:tc>
+        <w:tc>
+          <w:tcPr>
+            <w:tcW w:w="1185" w:type="dxa"/>
+          </w:tcPr>
+          <w:p/>
+        </w:tc>
+        <w:tc>
+          <w:tcPr>
+            <w:tcW w:w="1185" w:type="dxa"/>
+          </w:tcPr>
+          <w:p>
+            <w:r>
+              <w:t>Add advanced functions</w:t>
+            </w:r>
+          </w:p>
+        </w:tc>
+        <w:tc>
+          <w:tcPr>
+            <w:tcW w:w="1185" w:type="dxa"/>
+          </w:tcPr>
+          <w:p>
+            <w:r>
+              <w:t>Add sqrt, pi, sin, cos, tan</w:t>
+            </w:r>
+          </w:p>
+        </w:tc>
+        <w:tc>
+          <w:tcPr>
+            <w:tcW w:w="1185" w:type="dxa"/>
+          </w:tcPr>
+          <w:p>
+            <w:r>
+              <w:t>Add scientific buttons</w:t>
+            </w:r>
+          </w:p>
+        </w:tc>
+        <w:tc>
+          <w:tcPr>
+            <w:tcW w:w="1185" w:type="dxa"/>
+          </w:tcPr>
+          <w:p>
+            <w:r>
+              <w:t>Test scientific functions</w:t>
+            </w:r>
+          </w:p>
+        </w:tc>
+        <w:tc>
+          <w:tcPr>
+            <w:tcW w:w="1298" w:type="dxa"/>
+          </w:tcPr>
+          <w:p>
+            <w:r>
+              <w:t>Final testing and documentation</w:t>
+            </w:r>
+          </w:p>
+        </w:tc>
+      </w:tr>
+      <w:tr>
+        <w:trPr>
+          <w:trHeight w:val="300"/>
+        </w:trPr>
+        <w:tc>
+          <w:tcPr>
+            <w:tcW w:w="1185" w:type="dxa"/>
+          </w:tcPr>
+          <w:p>
+            <w:r>
+              <w:t>Meeting 4</w:t>
+            </w:r>
+          </w:p>
+        </w:tc>
+        <w:tc>
+          <w:tcPr>
+            <w:tcW w:w="1185" w:type="dxa"/>
+          </w:tcPr>
+          <w:p/>
+        </w:tc>
+        <w:tc>
+          <w:tcPr>
+            <w:tcW w:w="1185" w:type="dxa"/>
+          </w:tcPr>
+          <w:p>
+            <w:r>
+              <w:t xml:space="preserve">Final testing and </w:t>
+            </w:r>
+            <w:r>
+              <w:t>documentation</w:t>
+            </w:r>
+          </w:p>
+        </w:tc>
+        <w:tc>
+          <w:tcPr>
+            <w:tcW w:w="1185" w:type="dxa"/>
+          </w:tcPr>
+          <w:p>
+            <w:r>
+              <w:t xml:space="preserve">Fix </w:t>
+            </w:r>
+          </w:p>
+          <w:p>
+            <w:r>
+              <w:t>Backend</w:t>
+            </w:r>
+          </w:p>
+          <w:p>
+            <w:r>
+              <w:t>errors</w:t>
+            </w:r>
+          </w:p>
+        </w:tc>
+        <w:tc>
+          <w:tcPr>
+            <w:tcW w:w="1185" w:type="dxa"/>
+          </w:tcPr>
+          <w:p>
+            <w:r>
+              <w:t>Fic GUI layout</w:t>
+            </w:r>
+          </w:p>
+        </w:tc>
+        <w:tc>
+          <w:tcPr>
+            <w:tcW w:w="1185" w:type="dxa"/>
+          </w:tcPr>
+          <w:p>
+            <w:r>
+              <w:t>Testing evidence and final check</w:t>
+            </w:r>
+          </w:p>
+        </w:tc>
+        <w:tc>
+          <w:tcPr>
+            <w:tcW w:w="1298" w:type="dxa"/>
+          </w:tcPr>
+          <w:p>
+            <w:r>
+              <w:t>Prepare final submission</w:t>
+            </w:r>
+          </w:p>
+        </w:tc>
+      </w:tr>
+    </w:tbl>
     <w:p/>
     <w:p/>
     <w:p/>
@@ -979,6 +2087,10 @@
     </w:sectPr>
   </w:body>
 </w:document>
+</file>
+
+<file path=word/numbering.xml><?xml version="1.0" encoding="utf-8"?>
+<w:numbering xmlns:wpc="http://schemas.microsoft.com/office/word/2010/wordprocessingCanvas" xmlns:cx="http://schemas.microsoft.com/office/drawing/2014/chartex" xmlns:cx1="http://schemas.microsoft.com/office/drawing/2015/9/8/chartex" xmlns:cx2="http://schemas.microsoft.com/office/drawing/2015/10/21/chartex" xmlns:cx3="http://schemas.microsoft.com/office/drawing/2016/5/9/chartex" xmlns:cx4="http://schemas.microsoft.com/office/drawing/2016/5/10/chartex" xmlns:cx5="http://schemas.microsoft.com/office/drawing/2016/5/11/chartex" xmlns:cx6="http://schemas.microsoft.com/office/drawing/2016/5/12/chartex" xmlns:cx7="http://schemas.microsoft.com/office/drawing/2016/5/13/chartex" xmlns:cx8="http://schemas.microsoft.com/office/drawing/2016/5/14/chartex" xmlns:mc="http://schemas.openxmlformats.org/markup-compatibility/2006" xmlns:aink="http://schemas.microsoft.com/office/drawing/2016/ink" xmlns:am3d="http://schemas.microsoft.com/office/drawing/2017/model3d" xmlns:o="urn:schemas-microsoft-com:office:office" xmlns:oel="http://schemas.microsoft.com/office/2019/extlst" xmlns:r="http://schemas.openxmlformats.org/officeDocument/2006/relationships" xmlns:m="http://schemas.openxmlformats.org/officeDocument/2006/math" xmlns:v="urn:schemas-microsoft-com:vml" xmlns:wp14="http://schemas.microsoft.com/office/word/2010/wordprocessingDrawing" xmlns:wp="http://schemas.openxmlformats.org/drawingml/2006/wordprocessingDrawing" xmlns:w10="urn:schemas-microsoft-com:office:word" xmlns:w="http://schemas.openxmlformats.org/wordprocessingml/2006/main" xmlns:w14="http://schemas.microsoft.com/office/word/2010/wordml" xmlns:w15="http://schemas.microsoft.com/office/word/2012/wordml" xmlns:w16cex="http://schemas.microsoft.com/office/word/2018/wordml/cex" xmlns:w16cid="http://schemas.microsoft.com/office/word/2016/wordml/cid" xmlns:w16="http://schemas.microsoft.com/office/word/2018/wordml" xmlns:w16du="http://schemas.microsoft.com/office/word/2023/wordml/word16du" xmlns:w16sdtdh="http://schemas.microsoft.com/office/word/2020/wordml/sdtdatahash" xmlns:w16sdtfl="http://schemas.microsoft.com/office/word/2024/wordml/sdtformatlock" xmlns:w16se="http://schemas.microsoft.com/office/word/2015/wordml/symex" xmlns:wpg="http://schemas.microsoft.com/office/word/2010/wordprocessingGroup" xmlns:wpi="http://schemas.microsoft.com/office/word/2010/wordprocessingInk" xmlns:wne="http://schemas.microsoft.com/office/word/2006/wordml" xmlns:wps="http://schemas.microsoft.com/office/word/2010/wordprocessingShape" mc:Ignorable="w14 w15 w16se w16cid w16 w16cex w16sdtdh w16sdtfl w16du wp14"/>
 </file>
 
 <file path=word/styles.xml><?xml version="1.0" encoding="utf-8"?>

</xml_diff>

<commit_message>
change the layout design and fix some function
change button order, font size, bg colour, auto del display if 'Error', auto add '(' for sin cos tan and inverse and sqrt
</commit_message>
<xml_diff>
--- a/Meeting Minutes.docx
+++ b/Meeting Minutes.docx
@@ -391,7 +391,7 @@
     </w:p>
     <w:tbl>
       <w:tblPr>
-        <w:tblStyle w:val="TableGrid"/>
+        <w:tblStyle w:val="ae"/>
         <w:tblW w:w="0" w:type="auto"/>
         <w:tblLook w:val="06A0" w:firstRow="1" w:lastRow="0" w:firstColumn="1" w:lastColumn="0" w:noHBand="1" w:noVBand="1"/>
       </w:tblPr>
@@ -775,7 +775,7 @@
     </w:p>
     <w:tbl>
       <w:tblPr>
-        <w:tblStyle w:val="TableGrid"/>
+        <w:tblStyle w:val="ae"/>
         <w:tblW w:w="0" w:type="auto"/>
         <w:tblLook w:val="06A0" w:firstRow="1" w:lastRow="0" w:firstColumn="1" w:lastColumn="0" w:noHBand="1" w:noVBand="1"/>
       </w:tblPr>
@@ -919,7 +919,7 @@
     </w:p>
     <w:tbl>
       <w:tblPr>
-        <w:tblStyle w:val="TableGrid"/>
+        <w:tblStyle w:val="ae"/>
         <w:tblW w:w="0" w:type="auto"/>
         <w:tblLook w:val="06A0" w:firstRow="1" w:lastRow="0" w:firstColumn="1" w:lastColumn="0" w:noHBand="1" w:noVBand="1"/>
       </w:tblPr>
@@ -1310,7 +1310,7 @@
     </w:p>
     <w:tbl>
       <w:tblPr>
-        <w:tblStyle w:val="TableGrid"/>
+        <w:tblStyle w:val="ae"/>
         <w:tblW w:w="0" w:type="auto"/>
         <w:tblLook w:val="06A0" w:firstRow="1" w:lastRow="0" w:firstColumn="1" w:lastColumn="0" w:noHBand="1" w:noVBand="1"/>
       </w:tblPr>
@@ -1489,550 +1489,7 @@
       </w:tr>
     </w:tbl>
     <w:p/>
-    <w:p/>
-    <w:p/>
-    <w:p/>
-    <w:p/>
-    <w:p/>
-    <w:p/>
-    <w:tbl>
-      <w:tblPr>
-        <w:tblStyle w:val="TableGrid"/>
-        <w:tblW w:w="0" w:type="auto"/>
-        <w:tblLook w:val="06A0" w:firstRow="1" w:lastRow="0" w:firstColumn="1" w:lastColumn="0" w:noHBand="1" w:noVBand="1"/>
-      </w:tblPr>
-      <w:tblGrid>
-        <w:gridCol w:w="943"/>
-        <w:gridCol w:w="650"/>
-        <w:gridCol w:w="1616"/>
-        <w:gridCol w:w="1342"/>
-        <w:gridCol w:w="1050"/>
-        <w:gridCol w:w="1079"/>
-        <w:gridCol w:w="1616"/>
-      </w:tblGrid>
-      <w:tr>
-        <w:trPr>
-          <w:trHeight w:val="300"/>
-        </w:trPr>
-        <w:tc>
-          <w:tcPr>
-            <w:tcW w:w="1185" w:type="dxa"/>
-          </w:tcPr>
-          <w:p>
-            <w:r>
-              <w:t>Meeting</w:t>
-            </w:r>
-          </w:p>
-        </w:tc>
-        <w:tc>
-          <w:tcPr>
-            <w:tcW w:w="1185" w:type="dxa"/>
-          </w:tcPr>
-          <w:p>
-            <w:r>
-              <w:t>Date</w:t>
-            </w:r>
-          </w:p>
-        </w:tc>
-        <w:tc>
-          <w:tcPr>
-            <w:tcW w:w="1185" w:type="dxa"/>
-          </w:tcPr>
-          <w:p>
-            <w:r>
-              <w:t>Main Aim</w:t>
-            </w:r>
-          </w:p>
-        </w:tc>
-        <w:tc>
-          <w:tcPr>
-            <w:tcW w:w="1185" w:type="dxa"/>
-          </w:tcPr>
-          <w:p>
-            <w:r>
-              <w:t>Simon’s Task</w:t>
-            </w:r>
-          </w:p>
-        </w:tc>
-        <w:tc>
-          <w:tcPr>
-            <w:tcW w:w="1185" w:type="dxa"/>
-          </w:tcPr>
-          <w:p>
-            <w:r>
-              <w:t>Gareth’s</w:t>
-            </w:r>
-            <w:r>
-              <w:t xml:space="preserve"> Task</w:t>
-            </w:r>
-          </w:p>
-        </w:tc>
-        <w:tc>
-          <w:tcPr>
-            <w:tcW w:w="1185" w:type="dxa"/>
-          </w:tcPr>
-          <w:p>
-            <w:r>
-              <w:t>Group Task</w:t>
-            </w:r>
-          </w:p>
-        </w:tc>
-        <w:tc>
-          <w:tcPr>
-            <w:tcW w:w="1298" w:type="dxa"/>
-          </w:tcPr>
-          <w:p>
-            <w:r>
-              <w:t xml:space="preserve">Next </w:t>
-            </w:r>
-            <w:r>
-              <w:t>Goal</w:t>
-            </w:r>
-          </w:p>
-        </w:tc>
-      </w:tr>
-      <w:tr>
-        <w:trPr>
-          <w:trHeight w:val="300"/>
-        </w:trPr>
-        <w:tc>
-          <w:tcPr>
-            <w:tcW w:w="1185" w:type="dxa"/>
-          </w:tcPr>
-          <w:p>
-            <w:r>
-              <w:t>Meeting 1</w:t>
-            </w:r>
-          </w:p>
-        </w:tc>
-        <w:tc>
-          <w:tcPr>
-            <w:tcW w:w="1185" w:type="dxa"/>
-          </w:tcPr>
-          <w:p/>
-        </w:tc>
-        <w:tc>
-          <w:tcPr>
-            <w:tcW w:w="1185" w:type="dxa"/>
-          </w:tcPr>
-          <w:p>
-            <w:r>
-              <w:t xml:space="preserve">Divide project </w:t>
-            </w:r>
-            <w:r>
-              <w:t>tasks</w:t>
-            </w:r>
-          </w:p>
-        </w:tc>
-        <w:tc>
-          <w:tcPr>
-            <w:tcW w:w="1185" w:type="dxa"/>
-          </w:tcPr>
-          <w:p>
-            <w:r>
-              <w:t xml:space="preserve">Backend </w:t>
-            </w:r>
-            <w:r>
-              <w:t>planning</w:t>
-            </w:r>
-          </w:p>
-        </w:tc>
-        <w:tc>
-          <w:tcPr>
-            <w:tcW w:w="1185" w:type="dxa"/>
-          </w:tcPr>
-          <w:p>
-            <w:r>
-              <w:t>GUI planning</w:t>
-            </w:r>
-          </w:p>
-        </w:tc>
-        <w:tc>
-          <w:tcPr>
-            <w:tcW w:w="1185" w:type="dxa"/>
-          </w:tcPr>
-          <w:p>
-            <w:r>
-              <w:t>Discuss project idea and possible errors</w:t>
-            </w:r>
-          </w:p>
-        </w:tc>
-        <w:tc>
-          <w:tcPr>
-            <w:tcW w:w="1298" w:type="dxa"/>
-          </w:tcPr>
-          <w:p>
-            <w:r>
-              <w:t>Basic interfac</w:t>
-            </w:r>
-            <w:r>
-              <w:t>e and simple functions</w:t>
-            </w:r>
-          </w:p>
-        </w:tc>
-      </w:tr>
-      <w:tr>
-        <w:trPr>
-          <w:trHeight w:val="300"/>
-        </w:trPr>
-        <w:tc>
-          <w:tcPr>
-            <w:tcW w:w="1185" w:type="dxa"/>
-          </w:tcPr>
-          <w:p>
-            <w:r>
-              <w:t>Meeting 2</w:t>
-            </w:r>
-          </w:p>
-        </w:tc>
-        <w:tc>
-          <w:tcPr>
-            <w:tcW w:w="1185" w:type="dxa"/>
-          </w:tcPr>
-          <w:p/>
-        </w:tc>
-        <w:tc>
-          <w:tcPr>
-            <w:tcW w:w="1185" w:type="dxa"/>
-          </w:tcPr>
-          <w:p>
-            <w:r>
-              <w:t xml:space="preserve">Discuss backend and </w:t>
-            </w:r>
-            <w:proofErr w:type="gramStart"/>
-            <w:r>
-              <w:t xml:space="preserve">GUI  </w:t>
-            </w:r>
-            <w:r>
-              <w:t>Progress</w:t>
-            </w:r>
-            <w:proofErr w:type="gramEnd"/>
-          </w:p>
-        </w:tc>
-        <w:tc>
-          <w:tcPr>
-            <w:tcW w:w="1185" w:type="dxa"/>
-          </w:tcPr>
-          <w:p>
-            <w:r>
-              <w:t xml:space="preserve">Basic </w:t>
-            </w:r>
-            <w:proofErr w:type="gramStart"/>
-            <w:r>
-              <w:t xml:space="preserve">calculations </w:t>
-            </w:r>
-            <w:r>
-              <w:t xml:space="preserve"> </w:t>
-            </w:r>
-            <w:r>
-              <w:t>functions</w:t>
-            </w:r>
-            <w:proofErr w:type="gramEnd"/>
-          </w:p>
-          <w:p/>
-        </w:tc>
-        <w:tc>
-          <w:tcPr>
-            <w:tcW w:w="1185" w:type="dxa"/>
-          </w:tcPr>
-          <w:p>
-            <w:proofErr w:type="spellStart"/>
-            <w:r>
-              <w:t>Tkinter</w:t>
-            </w:r>
-            <w:proofErr w:type="spellEnd"/>
-            <w:r>
-              <w:t xml:space="preserve"> layout and buttons</w:t>
-            </w:r>
-          </w:p>
-        </w:tc>
-        <w:tc>
-          <w:tcPr>
-            <w:tcW w:w="1185" w:type="dxa"/>
-          </w:tcPr>
-          <w:p>
-            <w:r>
-              <w:t>Connect GUI with backend</w:t>
-            </w:r>
-          </w:p>
-        </w:tc>
-        <w:tc>
-          <w:tcPr>
-            <w:tcW w:w="1298" w:type="dxa"/>
-          </w:tcPr>
-          <w:p>
-            <w:r>
-              <w:t>Add scientific functions</w:t>
-            </w:r>
-          </w:p>
-        </w:tc>
-      </w:tr>
-      <w:tr>
-        <w:trPr>
-          <w:trHeight w:val="300"/>
-        </w:trPr>
-        <w:tc>
-          <w:tcPr>
-            <w:tcW w:w="1185" w:type="dxa"/>
-          </w:tcPr>
-          <w:p>
-            <w:r>
-              <w:t>Meeting 3</w:t>
-            </w:r>
-          </w:p>
-        </w:tc>
-        <w:tc>
-          <w:tcPr>
-            <w:tcW w:w="1185" w:type="dxa"/>
-          </w:tcPr>
-          <w:p/>
-        </w:tc>
-        <w:tc>
-          <w:tcPr>
-            <w:tcW w:w="1185" w:type="dxa"/>
-          </w:tcPr>
-          <w:p>
-            <w:r>
-              <w:t>Add advanced functions</w:t>
-            </w:r>
-          </w:p>
-        </w:tc>
-        <w:tc>
-          <w:tcPr>
-            <w:tcW w:w="1185" w:type="dxa"/>
-          </w:tcPr>
-          <w:p>
-            <w:r>
-              <w:t>Add sqrt, pi, sin, cos, tan</w:t>
-            </w:r>
-          </w:p>
-        </w:tc>
-        <w:tc>
-          <w:tcPr>
-            <w:tcW w:w="1185" w:type="dxa"/>
-          </w:tcPr>
-          <w:p>
-            <w:r>
-              <w:t>Add scientific buttons</w:t>
-            </w:r>
-          </w:p>
-        </w:tc>
-        <w:tc>
-          <w:tcPr>
-            <w:tcW w:w="1185" w:type="dxa"/>
-          </w:tcPr>
-          <w:p>
-            <w:r>
-              <w:t>Test scientific functions</w:t>
-            </w:r>
-          </w:p>
-        </w:tc>
-        <w:tc>
-          <w:tcPr>
-            <w:tcW w:w="1298" w:type="dxa"/>
-          </w:tcPr>
-          <w:p>
-            <w:r>
-              <w:t>Final testing and documentation</w:t>
-            </w:r>
-          </w:p>
-        </w:tc>
-      </w:tr>
-      <w:tr>
-        <w:trPr>
-          <w:trHeight w:val="300"/>
-        </w:trPr>
-        <w:tc>
-          <w:tcPr>
-            <w:tcW w:w="1185" w:type="dxa"/>
-          </w:tcPr>
-          <w:p>
-            <w:r>
-              <w:t>Meeting 4</w:t>
-            </w:r>
-          </w:p>
-        </w:tc>
-        <w:tc>
-          <w:tcPr>
-            <w:tcW w:w="1185" w:type="dxa"/>
-          </w:tcPr>
-          <w:p/>
-        </w:tc>
-        <w:tc>
-          <w:tcPr>
-            <w:tcW w:w="1185" w:type="dxa"/>
-          </w:tcPr>
-          <w:p>
-            <w:r>
-              <w:t xml:space="preserve">Final testing and </w:t>
-            </w:r>
-            <w:r>
-              <w:t>documentati</w:t>
-            </w:r>
-            <w:r>
-              <w:lastRenderedPageBreak/>
-              <w:t>on</w:t>
-            </w:r>
-          </w:p>
-        </w:tc>
-        <w:tc>
-          <w:tcPr>
-            <w:tcW w:w="1185" w:type="dxa"/>
-          </w:tcPr>
-          <w:p>
-            <w:r>
-              <w:lastRenderedPageBreak/>
-              <w:t xml:space="preserve">Fix </w:t>
-            </w:r>
-          </w:p>
-          <w:p>
-            <w:r>
-              <w:t>Backend</w:t>
-            </w:r>
-          </w:p>
-          <w:p>
-            <w:r>
-              <w:t>errors</w:t>
-            </w:r>
-          </w:p>
-        </w:tc>
-        <w:tc>
-          <w:tcPr>
-            <w:tcW w:w="1185" w:type="dxa"/>
-          </w:tcPr>
-          <w:p>
-            <w:r>
-              <w:t>Fic GUI layout</w:t>
-            </w:r>
-          </w:p>
-        </w:tc>
-        <w:tc>
-          <w:tcPr>
-            <w:tcW w:w="1185" w:type="dxa"/>
-          </w:tcPr>
-          <w:p>
-            <w:r>
-              <w:t xml:space="preserve">Testing evidence and </w:t>
-            </w:r>
-            <w:r>
-              <w:lastRenderedPageBreak/>
-              <w:t>final check</w:t>
-            </w:r>
-          </w:p>
-        </w:tc>
-        <w:tc>
-          <w:tcPr>
-            <w:tcW w:w="1298" w:type="dxa"/>
-          </w:tcPr>
-          <w:p>
-            <w:r>
-              <w:lastRenderedPageBreak/>
-              <w:t>Prepare final submission</w:t>
-            </w:r>
-          </w:p>
-        </w:tc>
-      </w:tr>
-    </w:tbl>
-    <w:p/>
-    <w:p/>
-    <w:p/>
-    <w:p/>
-    <w:p/>
-    <w:p/>
-    <w:p/>
-    <w:p/>
-    <w:p/>
-    <w:p>
-      <w:r>
-        <w:br/>
-      </w:r>
-    </w:p>
-    <w:p>
-      <w:pPr>
-        <w:widowControl/>
-      </w:pPr>
-      <w:r>
-        <w:br w:type="page"/>
-      </w:r>
-    </w:p>
     <w:bookmarkEnd w:id="0"/>
-    <w:p>
-      <w:pPr>
-        <w:widowControl/>
-      </w:pPr>
-      <w:r>
-        <w:lastRenderedPageBreak/>
-        <w:br w:type="page"/>
-      </w:r>
-    </w:p>
-    <w:p>
-      <w:pPr>
-        <w:jc w:val="center"/>
-      </w:pPr>
-      <w:r>
-        <w:lastRenderedPageBreak/>
-        <w:t>Meeting Minutes 3</w:t>
-      </w:r>
-    </w:p>
-    <w:p>
-      <w:r>
-        <w:t>Date: /5/2026</w:t>
-      </w:r>
-    </w:p>
-    <w:p>
-      <w:r>
-        <w:t xml:space="preserve">Attendees: Simon and Gareth </w:t>
-      </w:r>
-    </w:p>
-    <w:p>
-      <w:r>
-        <w:t xml:space="preserve">Aims: </w:t>
-      </w:r>
-    </w:p>
-    <w:p/>
-    <w:p>
-      <w:r>
-        <w:t xml:space="preserve">Agenda: </w:t>
-      </w:r>
-    </w:p>
-    <w:p>
-      <w:r>
-        <w:tab/>
-      </w:r>
-    </w:p>
-    <w:p>
-      <w:r>
-        <w:t>Discussion points:</w:t>
-      </w:r>
-    </w:p>
-    <w:p>
-      <w:r>
-        <w:tab/>
-      </w:r>
-    </w:p>
-    <w:p/>
-    <w:p>
-      <w:r>
-        <w:t>Action items:</w:t>
-      </w:r>
-    </w:p>
-    <w:p>
-      <w:r>
-        <w:tab/>
-      </w:r>
-    </w:p>
-    <w:p/>
-    <w:p>
-      <w:r>
-        <w:t xml:space="preserve">Next meeting: </w:t>
-      </w:r>
-    </w:p>
-    <w:p>
-      <w:r>
-        <w:tab/>
-        <w:t xml:space="preserve">Goal: </w:t>
-      </w:r>
-    </w:p>
     <w:p/>
     <w:sectPr>
       <w:pgSz w:w="11906" w:h="16838"/>
@@ -2044,8 +1501,54 @@
 </w:document>
 </file>
 
-<file path=word/numbering.xml><?xml version="1.0" encoding="utf-8"?>
-<w:numbering xmlns:wpc="http://schemas.microsoft.com/office/word/2010/wordprocessingCanvas" xmlns:cx="http://schemas.microsoft.com/office/drawing/2014/chartex" xmlns:cx1="http://schemas.microsoft.com/office/drawing/2015/9/8/chartex" xmlns:cx2="http://schemas.microsoft.com/office/drawing/2015/10/21/chartex" xmlns:cx3="http://schemas.microsoft.com/office/drawing/2016/5/9/chartex" xmlns:cx4="http://schemas.microsoft.com/office/drawing/2016/5/10/chartex" xmlns:cx5="http://schemas.microsoft.com/office/drawing/2016/5/11/chartex" xmlns:cx6="http://schemas.microsoft.com/office/drawing/2016/5/12/chartex" xmlns:cx7="http://schemas.microsoft.com/office/drawing/2016/5/13/chartex" xmlns:cx8="http://schemas.microsoft.com/office/drawing/2016/5/14/chartex" xmlns:mc="http://schemas.openxmlformats.org/markup-compatibility/2006" xmlns:aink="http://schemas.microsoft.com/office/drawing/2016/ink" xmlns:am3d="http://schemas.microsoft.com/office/drawing/2017/model3d" xmlns:o="urn:schemas-microsoft-com:office:office" xmlns:oel="http://schemas.microsoft.com/office/2019/extlst" xmlns:r="http://schemas.openxmlformats.org/officeDocument/2006/relationships" xmlns:m="http://schemas.openxmlformats.org/officeDocument/2006/math" xmlns:v="urn:schemas-microsoft-com:vml" xmlns:wp14="http://schemas.microsoft.com/office/word/2010/wordprocessingDrawing" xmlns:wp="http://schemas.openxmlformats.org/drawingml/2006/wordprocessingDrawing" xmlns:w10="urn:schemas-microsoft-com:office:word" xmlns:w="http://schemas.openxmlformats.org/wordprocessingml/2006/main" xmlns:w14="http://schemas.microsoft.com/office/word/2010/wordml" xmlns:w15="http://schemas.microsoft.com/office/word/2012/wordml" xmlns:w16cex="http://schemas.microsoft.com/office/word/2018/wordml/cex" xmlns:w16cid="http://schemas.microsoft.com/office/word/2016/wordml/cid" xmlns:w16="http://schemas.microsoft.com/office/word/2018/wordml" xmlns:w16du="http://schemas.microsoft.com/office/word/2023/wordml/word16du" xmlns:w16sdtdh="http://schemas.microsoft.com/office/word/2020/wordml/sdtdatahash" xmlns:w16sdtfl="http://schemas.microsoft.com/office/word/2024/wordml/sdtformatlock" xmlns:w16se="http://schemas.microsoft.com/office/word/2015/wordml/symex" xmlns:wpg="http://schemas.microsoft.com/office/word/2010/wordprocessingGroup" xmlns:wpi="http://schemas.microsoft.com/office/word/2010/wordprocessingInk" xmlns:wne="http://schemas.microsoft.com/office/word/2006/wordml" xmlns:wps="http://schemas.microsoft.com/office/word/2010/wordprocessingShape" mc:Ignorable="w14 w15 w16se w16cid w16 w16cex w16sdtdh w16sdtfl w16du wp14"/>
+<file path=word/endnotes.xml><?xml version="1.0" encoding="utf-8"?>
+<w:endnotes xmlns:wpc="http://schemas.microsoft.com/office/word/2010/wordprocessingCanvas" xmlns:cx="http://schemas.microsoft.com/office/drawing/2014/chartex" xmlns:cx1="http://schemas.microsoft.com/office/drawing/2015/9/8/chartex" xmlns:cx2="http://schemas.microsoft.com/office/drawing/2015/10/21/chartex" xmlns:cx3="http://schemas.microsoft.com/office/drawing/2016/5/9/chartex" xmlns:cx4="http://schemas.microsoft.com/office/drawing/2016/5/10/chartex" xmlns:cx5="http://schemas.microsoft.com/office/drawing/2016/5/11/chartex" xmlns:cx6="http://schemas.microsoft.com/office/drawing/2016/5/12/chartex" xmlns:cx7="http://schemas.microsoft.com/office/drawing/2016/5/13/chartex" xmlns:cx8="http://schemas.microsoft.com/office/drawing/2016/5/14/chartex" xmlns:mc="http://schemas.openxmlformats.org/markup-compatibility/2006" xmlns:aink="http://schemas.microsoft.com/office/drawing/2016/ink" xmlns:am3d="http://schemas.microsoft.com/office/drawing/2017/model3d" xmlns:o="urn:schemas-microsoft-com:office:office" xmlns:oel="http://schemas.microsoft.com/office/2019/extlst" xmlns:r="http://schemas.openxmlformats.org/officeDocument/2006/relationships" xmlns:m="http://schemas.openxmlformats.org/officeDocument/2006/math" xmlns:v="urn:schemas-microsoft-com:vml" xmlns:wp14="http://schemas.microsoft.com/office/word/2010/wordprocessingDrawing" xmlns:wp="http://schemas.openxmlformats.org/drawingml/2006/wordprocessingDrawing" xmlns:w10="urn:schemas-microsoft-com:office:word" xmlns:w="http://schemas.openxmlformats.org/wordprocessingml/2006/main" xmlns:w14="http://schemas.microsoft.com/office/word/2010/wordml" xmlns:w15="http://schemas.microsoft.com/office/word/2012/wordml" xmlns:w16cex="http://schemas.microsoft.com/office/word/2018/wordml/cex" xmlns:w16cid="http://schemas.microsoft.com/office/word/2016/wordml/cid" xmlns:w16="http://schemas.microsoft.com/office/word/2018/wordml" xmlns:w16du="http://schemas.microsoft.com/office/word/2023/wordml/word16du" xmlns:w16sdtdh="http://schemas.microsoft.com/office/word/2020/wordml/sdtdatahash" xmlns:w16sdtfl="http://schemas.microsoft.com/office/word/2024/wordml/sdtformatlock" xmlns:w16se="http://schemas.microsoft.com/office/word/2015/wordml/symex" xmlns:wpg="http://schemas.microsoft.com/office/word/2010/wordprocessingGroup" xmlns:wpi="http://schemas.microsoft.com/office/word/2010/wordprocessingInk" xmlns:wne="http://schemas.microsoft.com/office/word/2006/wordml" xmlns:wps="http://schemas.microsoft.com/office/word/2010/wordprocessingShape" mc:Ignorable="w14 w15 w16se w16cid w16 w16cex w16sdtdh w16sdtfl w16du wp14">
+  <w:endnote w:type="separator" w:id="-1">
+    <w:p>
+      <w:pPr>
+        <w:spacing w:after="0" w:line="240" w:lineRule="auto"/>
+      </w:pPr>
+      <w:r>
+        <w:separator/>
+      </w:r>
+    </w:p>
+  </w:endnote>
+  <w:endnote w:type="continuationSeparator" w:id="0">
+    <w:p>
+      <w:pPr>
+        <w:spacing w:after="0" w:line="240" w:lineRule="auto"/>
+      </w:pPr>
+      <w:r>
+        <w:continuationSeparator/>
+      </w:r>
+    </w:p>
+  </w:endnote>
+</w:endnotes>
+</file>
+
+<file path=word/footnotes.xml><?xml version="1.0" encoding="utf-8"?>
+<w:footnotes xmlns:wpc="http://schemas.microsoft.com/office/word/2010/wordprocessingCanvas" xmlns:cx="http://schemas.microsoft.com/office/drawing/2014/chartex" xmlns:cx1="http://schemas.microsoft.com/office/drawing/2015/9/8/chartex" xmlns:cx2="http://schemas.microsoft.com/office/drawing/2015/10/21/chartex" xmlns:cx3="http://schemas.microsoft.com/office/drawing/2016/5/9/chartex" xmlns:cx4="http://schemas.microsoft.com/office/drawing/2016/5/10/chartex" xmlns:cx5="http://schemas.microsoft.com/office/drawing/2016/5/11/chartex" xmlns:cx6="http://schemas.microsoft.com/office/drawing/2016/5/12/chartex" xmlns:cx7="http://schemas.microsoft.com/office/drawing/2016/5/13/chartex" xmlns:cx8="http://schemas.microsoft.com/office/drawing/2016/5/14/chartex" xmlns:mc="http://schemas.openxmlformats.org/markup-compatibility/2006" xmlns:aink="http://schemas.microsoft.com/office/drawing/2016/ink" xmlns:am3d="http://schemas.microsoft.com/office/drawing/2017/model3d" xmlns:o="urn:schemas-microsoft-com:office:office" xmlns:oel="http://schemas.microsoft.com/office/2019/extlst" xmlns:r="http://schemas.openxmlformats.org/officeDocument/2006/relationships" xmlns:m="http://schemas.openxmlformats.org/officeDocument/2006/math" xmlns:v="urn:schemas-microsoft-com:vml" xmlns:wp14="http://schemas.microsoft.com/office/word/2010/wordprocessingDrawing" xmlns:wp="http://schemas.openxmlformats.org/drawingml/2006/wordprocessingDrawing" xmlns:w10="urn:schemas-microsoft-com:office:word" xmlns:w="http://schemas.openxmlformats.org/wordprocessingml/2006/main" xmlns:w14="http://schemas.microsoft.com/office/word/2010/wordml" xmlns:w15="http://schemas.microsoft.com/office/word/2012/wordml" xmlns:w16cex="http://schemas.microsoft.com/office/word/2018/wordml/cex" xmlns:w16cid="http://schemas.microsoft.com/office/word/2016/wordml/cid" xmlns:w16="http://schemas.microsoft.com/office/word/2018/wordml" xmlns:w16du="http://schemas.microsoft.com/office/word/2023/wordml/word16du" xmlns:w16sdtdh="http://schemas.microsoft.com/office/word/2020/wordml/sdtdatahash" xmlns:w16sdtfl="http://schemas.microsoft.com/office/word/2024/wordml/sdtformatlock" xmlns:w16se="http://schemas.microsoft.com/office/word/2015/wordml/symex" xmlns:wpg="http://schemas.microsoft.com/office/word/2010/wordprocessingGroup" xmlns:wpi="http://schemas.microsoft.com/office/word/2010/wordprocessingInk" xmlns:wne="http://schemas.microsoft.com/office/word/2006/wordml" xmlns:wps="http://schemas.microsoft.com/office/word/2010/wordprocessingShape" mc:Ignorable="w14 w15 w16se w16cid w16 w16cex w16sdtdh w16sdtfl w16du wp14">
+  <w:footnote w:type="separator" w:id="-1">
+    <w:p>
+      <w:pPr>
+        <w:spacing w:after="0" w:line="240" w:lineRule="auto"/>
+      </w:pPr>
+      <w:r>
+        <w:separator/>
+      </w:r>
+    </w:p>
+  </w:footnote>
+  <w:footnote w:type="continuationSeparator" w:id="0">
+    <w:p>
+      <w:pPr>
+        <w:spacing w:after="0" w:line="240" w:lineRule="auto"/>
+      </w:pPr>
+      <w:r>
+        <w:continuationSeparator/>
+      </w:r>
+    </w:p>
+  </w:footnote>
+</w:footnotes>
 </file>
 
 <file path=word/styles.xml><?xml version="1.0" encoding="utf-8"?>
@@ -2445,18 +1948,18 @@
     <w:lsdException w:name="Unresolved Mention" w:semiHidden="1" w:unhideWhenUsed="1"/>
     <w:lsdException w:name="Smart Link" w:semiHidden="1" w:unhideWhenUsed="1"/>
   </w:latentStyles>
-  <w:style w:type="paragraph" w:default="1" w:styleId="Normal">
+  <w:style w:type="paragraph" w:default="1" w:styleId="a">
     <w:name w:val="Normal"/>
     <w:qFormat/>
     <w:pPr>
       <w:widowControl w:val="0"/>
     </w:pPr>
   </w:style>
-  <w:style w:type="paragraph" w:styleId="Heading1">
+  <w:style w:type="paragraph" w:styleId="1">
     <w:name w:val="heading 1"/>
-    <w:basedOn w:val="Normal"/>
-    <w:next w:val="Normal"/>
-    <w:link w:val="Heading1Char"/>
+    <w:basedOn w:val="a"/>
+    <w:next w:val="a"/>
+    <w:link w:val="10"/>
     <w:uiPriority w:val="9"/>
     <w:qFormat/>
     <w:rsid w:val="00315081"/>
@@ -2473,11 +1976,11 @@
       <w:szCs w:val="48"/>
     </w:rPr>
   </w:style>
-  <w:style w:type="paragraph" w:styleId="Heading2">
+  <w:style w:type="paragraph" w:styleId="2">
     <w:name w:val="heading 2"/>
-    <w:basedOn w:val="Normal"/>
-    <w:next w:val="Normal"/>
-    <w:link w:val="Heading2Char"/>
+    <w:basedOn w:val="a"/>
+    <w:next w:val="a"/>
+    <w:link w:val="20"/>
     <w:uiPriority w:val="9"/>
     <w:semiHidden/>
     <w:unhideWhenUsed/>
@@ -2496,11 +1999,11 @@
       <w:szCs w:val="40"/>
     </w:rPr>
   </w:style>
-  <w:style w:type="paragraph" w:styleId="Heading3">
+  <w:style w:type="paragraph" w:styleId="3">
     <w:name w:val="heading 3"/>
-    <w:basedOn w:val="Normal"/>
-    <w:next w:val="Normal"/>
-    <w:link w:val="Heading3Char"/>
+    <w:basedOn w:val="a"/>
+    <w:next w:val="a"/>
+    <w:link w:val="30"/>
     <w:uiPriority w:val="9"/>
     <w:semiHidden/>
     <w:unhideWhenUsed/>
@@ -2519,11 +2022,11 @@
       <w:szCs w:val="32"/>
     </w:rPr>
   </w:style>
-  <w:style w:type="paragraph" w:styleId="Heading4">
+  <w:style w:type="paragraph" w:styleId="4">
     <w:name w:val="heading 4"/>
-    <w:basedOn w:val="Normal"/>
-    <w:next w:val="Normal"/>
-    <w:link w:val="Heading4Char"/>
+    <w:basedOn w:val="a"/>
+    <w:next w:val="a"/>
+    <w:link w:val="40"/>
     <w:uiPriority w:val="9"/>
     <w:semiHidden/>
     <w:unhideWhenUsed/>
@@ -2542,11 +2045,11 @@
       <w:szCs w:val="28"/>
     </w:rPr>
   </w:style>
-  <w:style w:type="paragraph" w:styleId="Heading5">
+  <w:style w:type="paragraph" w:styleId="5">
     <w:name w:val="heading 5"/>
-    <w:basedOn w:val="Normal"/>
-    <w:next w:val="Normal"/>
-    <w:link w:val="Heading5Char"/>
+    <w:basedOn w:val="a"/>
+    <w:next w:val="a"/>
+    <w:link w:val="50"/>
     <w:uiPriority w:val="9"/>
     <w:semiHidden/>
     <w:unhideWhenUsed/>
@@ -2563,11 +2066,11 @@
       <w:color w:val="0F4761" w:themeColor="accent1" w:themeShade="BF"/>
     </w:rPr>
   </w:style>
-  <w:style w:type="paragraph" w:styleId="Heading6">
+  <w:style w:type="paragraph" w:styleId="6">
     <w:name w:val="heading 6"/>
-    <w:basedOn w:val="Normal"/>
-    <w:next w:val="Normal"/>
-    <w:link w:val="Heading6Char"/>
+    <w:basedOn w:val="a"/>
+    <w:next w:val="a"/>
+    <w:link w:val="60"/>
     <w:uiPriority w:val="9"/>
     <w:semiHidden/>
     <w:unhideWhenUsed/>
@@ -2584,11 +2087,11 @@
       <w:color w:val="595959" w:themeColor="text1" w:themeTint="A6"/>
     </w:rPr>
   </w:style>
-  <w:style w:type="paragraph" w:styleId="Heading7">
+  <w:style w:type="paragraph" w:styleId="7">
     <w:name w:val="heading 7"/>
-    <w:basedOn w:val="Normal"/>
-    <w:next w:val="Normal"/>
-    <w:link w:val="Heading7Char"/>
+    <w:basedOn w:val="a"/>
+    <w:next w:val="a"/>
+    <w:link w:val="70"/>
     <w:uiPriority w:val="9"/>
     <w:semiHidden/>
     <w:unhideWhenUsed/>
@@ -2606,11 +2109,11 @@
       <w:color w:val="595959" w:themeColor="text1" w:themeTint="A6"/>
     </w:rPr>
   </w:style>
-  <w:style w:type="paragraph" w:styleId="Heading8">
+  <w:style w:type="paragraph" w:styleId="8">
     <w:name w:val="heading 8"/>
-    <w:basedOn w:val="Normal"/>
-    <w:next w:val="Normal"/>
-    <w:link w:val="Heading8Char"/>
+    <w:basedOn w:val="a"/>
+    <w:next w:val="a"/>
+    <w:link w:val="80"/>
     <w:uiPriority w:val="9"/>
     <w:semiHidden/>
     <w:unhideWhenUsed/>
@@ -2628,11 +2131,11 @@
       <w:color w:val="272727" w:themeColor="text1" w:themeTint="D8"/>
     </w:rPr>
   </w:style>
-  <w:style w:type="paragraph" w:styleId="Heading9">
+  <w:style w:type="paragraph" w:styleId="9">
     <w:name w:val="heading 9"/>
-    <w:basedOn w:val="Normal"/>
-    <w:next w:val="Normal"/>
-    <w:link w:val="Heading9Char"/>
+    <w:basedOn w:val="a"/>
+    <w:next w:val="a"/>
+    <w:link w:val="90"/>
     <w:uiPriority w:val="9"/>
     <w:semiHidden/>
     <w:unhideWhenUsed/>
@@ -2650,13 +2153,13 @@
       <w:color w:val="272727" w:themeColor="text1" w:themeTint="D8"/>
     </w:rPr>
   </w:style>
-  <w:style w:type="character" w:default="1" w:styleId="DefaultParagraphFont">
+  <w:style w:type="character" w:default="1" w:styleId="a0">
     <w:name w:val="Default Paragraph Font"/>
     <w:uiPriority w:val="1"/>
     <w:semiHidden/>
     <w:unhideWhenUsed/>
   </w:style>
-  <w:style w:type="table" w:default="1" w:styleId="TableNormal">
+  <w:style w:type="table" w:default="1" w:styleId="a1">
     <w:name w:val="Normal Table"/>
     <w:uiPriority w:val="99"/>
     <w:semiHidden/>
@@ -2671,16 +2174,16 @@
       </w:tblCellMar>
     </w:tblPr>
   </w:style>
-  <w:style w:type="numbering" w:default="1" w:styleId="NoList">
+  <w:style w:type="numbering" w:default="1" w:styleId="a2">
     <w:name w:val="No List"/>
     <w:uiPriority w:val="99"/>
     <w:semiHidden/>
     <w:unhideWhenUsed/>
   </w:style>
-  <w:style w:type="character" w:customStyle="1" w:styleId="Heading1Char">
-    <w:name w:val="Heading 1 Char"/>
-    <w:basedOn w:val="DefaultParagraphFont"/>
-    <w:link w:val="Heading1"/>
+  <w:style w:type="character" w:customStyle="1" w:styleId="10">
+    <w:name w:val="標題 1 字元"/>
+    <w:basedOn w:val="a0"/>
+    <w:link w:val="1"/>
     <w:uiPriority w:val="9"/>
     <w:rsid w:val="00315081"/>
     <w:rPr>
@@ -2690,10 +2193,10 @@
       <w:szCs w:val="48"/>
     </w:rPr>
   </w:style>
-  <w:style w:type="character" w:customStyle="1" w:styleId="Heading2Char">
-    <w:name w:val="Heading 2 Char"/>
-    <w:basedOn w:val="DefaultParagraphFont"/>
-    <w:link w:val="Heading2"/>
+  <w:style w:type="character" w:customStyle="1" w:styleId="20">
+    <w:name w:val="標題 2 字元"/>
+    <w:basedOn w:val="a0"/>
+    <w:link w:val="2"/>
     <w:uiPriority w:val="9"/>
     <w:semiHidden/>
     <w:rsid w:val="00315081"/>
@@ -2704,10 +2207,10 @@
       <w:szCs w:val="40"/>
     </w:rPr>
   </w:style>
-  <w:style w:type="character" w:customStyle="1" w:styleId="Heading3Char">
-    <w:name w:val="Heading 3 Char"/>
-    <w:basedOn w:val="DefaultParagraphFont"/>
-    <w:link w:val="Heading3"/>
+  <w:style w:type="character" w:customStyle="1" w:styleId="30">
+    <w:name w:val="標題 3 字元"/>
+    <w:basedOn w:val="a0"/>
+    <w:link w:val="3"/>
     <w:uiPriority w:val="9"/>
     <w:semiHidden/>
     <w:rsid w:val="00315081"/>
@@ -2718,10 +2221,10 @@
       <w:szCs w:val="32"/>
     </w:rPr>
   </w:style>
-  <w:style w:type="character" w:customStyle="1" w:styleId="Heading4Char">
-    <w:name w:val="Heading 4 Char"/>
-    <w:basedOn w:val="DefaultParagraphFont"/>
-    <w:link w:val="Heading4"/>
+  <w:style w:type="character" w:customStyle="1" w:styleId="40">
+    <w:name w:val="標題 4 字元"/>
+    <w:basedOn w:val="a0"/>
+    <w:link w:val="4"/>
     <w:uiPriority w:val="9"/>
     <w:semiHidden/>
     <w:rsid w:val="00315081"/>
@@ -2732,10 +2235,10 @@
       <w:szCs w:val="28"/>
     </w:rPr>
   </w:style>
-  <w:style w:type="character" w:customStyle="1" w:styleId="Heading5Char">
-    <w:name w:val="Heading 5 Char"/>
-    <w:basedOn w:val="DefaultParagraphFont"/>
-    <w:link w:val="Heading5"/>
+  <w:style w:type="character" w:customStyle="1" w:styleId="50">
+    <w:name w:val="標題 5 字元"/>
+    <w:basedOn w:val="a0"/>
+    <w:link w:val="5"/>
     <w:uiPriority w:val="9"/>
     <w:semiHidden/>
     <w:rsid w:val="00315081"/>
@@ -2744,10 +2247,10 @@
       <w:color w:val="0F4761" w:themeColor="accent1" w:themeShade="BF"/>
     </w:rPr>
   </w:style>
-  <w:style w:type="character" w:customStyle="1" w:styleId="Heading6Char">
-    <w:name w:val="Heading 6 Char"/>
-    <w:basedOn w:val="DefaultParagraphFont"/>
-    <w:link w:val="Heading6"/>
+  <w:style w:type="character" w:customStyle="1" w:styleId="60">
+    <w:name w:val="標題 6 字元"/>
+    <w:basedOn w:val="a0"/>
+    <w:link w:val="6"/>
     <w:uiPriority w:val="9"/>
     <w:semiHidden/>
     <w:rsid w:val="00315081"/>
@@ -2756,10 +2259,10 @@
       <w:color w:val="595959" w:themeColor="text1" w:themeTint="A6"/>
     </w:rPr>
   </w:style>
-  <w:style w:type="character" w:customStyle="1" w:styleId="Heading7Char">
-    <w:name w:val="Heading 7 Char"/>
-    <w:basedOn w:val="DefaultParagraphFont"/>
-    <w:link w:val="Heading7"/>
+  <w:style w:type="character" w:customStyle="1" w:styleId="70">
+    <w:name w:val="標題 7 字元"/>
+    <w:basedOn w:val="a0"/>
+    <w:link w:val="7"/>
     <w:uiPriority w:val="9"/>
     <w:semiHidden/>
     <w:rsid w:val="00315081"/>
@@ -2768,10 +2271,10 @@
       <w:color w:val="595959" w:themeColor="text1" w:themeTint="A6"/>
     </w:rPr>
   </w:style>
-  <w:style w:type="character" w:customStyle="1" w:styleId="Heading8Char">
-    <w:name w:val="Heading 8 Char"/>
-    <w:basedOn w:val="DefaultParagraphFont"/>
-    <w:link w:val="Heading8"/>
+  <w:style w:type="character" w:customStyle="1" w:styleId="80">
+    <w:name w:val="標題 8 字元"/>
+    <w:basedOn w:val="a0"/>
+    <w:link w:val="8"/>
     <w:uiPriority w:val="9"/>
     <w:semiHidden/>
     <w:rsid w:val="00315081"/>
@@ -2780,10 +2283,10 @@
       <w:color w:val="272727" w:themeColor="text1" w:themeTint="D8"/>
     </w:rPr>
   </w:style>
-  <w:style w:type="character" w:customStyle="1" w:styleId="Heading9Char">
-    <w:name w:val="Heading 9 Char"/>
-    <w:basedOn w:val="DefaultParagraphFont"/>
-    <w:link w:val="Heading9"/>
+  <w:style w:type="character" w:customStyle="1" w:styleId="90">
+    <w:name w:val="標題 9 字元"/>
+    <w:basedOn w:val="a0"/>
+    <w:link w:val="9"/>
     <w:uiPriority w:val="9"/>
     <w:semiHidden/>
     <w:rsid w:val="00315081"/>
@@ -2792,11 +2295,11 @@
       <w:color w:val="272727" w:themeColor="text1" w:themeTint="D8"/>
     </w:rPr>
   </w:style>
-  <w:style w:type="paragraph" w:styleId="Title">
+  <w:style w:type="paragraph" w:styleId="a3">
     <w:name w:val="Title"/>
-    <w:basedOn w:val="Normal"/>
-    <w:next w:val="Normal"/>
-    <w:link w:val="TitleChar"/>
+    <w:basedOn w:val="a"/>
+    <w:next w:val="a"/>
+    <w:link w:val="a4"/>
     <w:uiPriority w:val="10"/>
     <w:qFormat/>
     <w:rsid w:val="00315081"/>
@@ -2813,10 +2316,10 @@
       <w:szCs w:val="56"/>
     </w:rPr>
   </w:style>
-  <w:style w:type="character" w:customStyle="1" w:styleId="TitleChar">
-    <w:name w:val="Title Char"/>
-    <w:basedOn w:val="DefaultParagraphFont"/>
-    <w:link w:val="Title"/>
+  <w:style w:type="character" w:customStyle="1" w:styleId="a4">
+    <w:name w:val="標題 字元"/>
+    <w:basedOn w:val="a0"/>
+    <w:link w:val="a3"/>
     <w:uiPriority w:val="10"/>
     <w:rsid w:val="00315081"/>
     <w:rPr>
@@ -2827,11 +2330,11 @@
       <w:szCs w:val="56"/>
     </w:rPr>
   </w:style>
-  <w:style w:type="paragraph" w:styleId="Subtitle">
+  <w:style w:type="paragraph" w:styleId="a5">
     <w:name w:val="Subtitle"/>
-    <w:basedOn w:val="Normal"/>
-    <w:next w:val="Normal"/>
-    <w:link w:val="SubtitleChar"/>
+    <w:basedOn w:val="a"/>
+    <w:next w:val="a"/>
+    <w:link w:val="a6"/>
     <w:uiPriority w:val="11"/>
     <w:qFormat/>
     <w:rsid w:val="00315081"/>
@@ -2849,10 +2352,10 @@
       <w:szCs w:val="28"/>
     </w:rPr>
   </w:style>
-  <w:style w:type="character" w:customStyle="1" w:styleId="SubtitleChar">
-    <w:name w:val="Subtitle Char"/>
-    <w:basedOn w:val="DefaultParagraphFont"/>
-    <w:link w:val="Subtitle"/>
+  <w:style w:type="character" w:customStyle="1" w:styleId="a6">
+    <w:name w:val="副標題 字元"/>
+    <w:basedOn w:val="a0"/>
+    <w:link w:val="a5"/>
     <w:uiPriority w:val="11"/>
     <w:rsid w:val="00315081"/>
     <w:rPr>
@@ -2863,11 +2366,11 @@
       <w:szCs w:val="28"/>
     </w:rPr>
   </w:style>
-  <w:style w:type="paragraph" w:styleId="Quote">
+  <w:style w:type="paragraph" w:styleId="a7">
     <w:name w:val="Quote"/>
-    <w:basedOn w:val="Normal"/>
-    <w:next w:val="Normal"/>
-    <w:link w:val="QuoteChar"/>
+    <w:basedOn w:val="a"/>
+    <w:next w:val="a"/>
+    <w:link w:val="a8"/>
     <w:uiPriority w:val="29"/>
     <w:qFormat/>
     <w:rsid w:val="00315081"/>
@@ -2881,10 +2384,10 @@
       <w:color w:val="404040" w:themeColor="text1" w:themeTint="BF"/>
     </w:rPr>
   </w:style>
-  <w:style w:type="character" w:customStyle="1" w:styleId="QuoteChar">
-    <w:name w:val="Quote Char"/>
-    <w:basedOn w:val="DefaultParagraphFont"/>
-    <w:link w:val="Quote"/>
+  <w:style w:type="character" w:customStyle="1" w:styleId="a8">
+    <w:name w:val="引文 字元"/>
+    <w:basedOn w:val="a0"/>
+    <w:link w:val="a7"/>
     <w:uiPriority w:val="29"/>
     <w:rsid w:val="00315081"/>
     <w:rPr>
@@ -2893,9 +2396,9 @@
       <w:color w:val="404040" w:themeColor="text1" w:themeTint="BF"/>
     </w:rPr>
   </w:style>
-  <w:style w:type="paragraph" w:styleId="ListParagraph">
+  <w:style w:type="paragraph" w:styleId="a9">
     <w:name w:val="List Paragraph"/>
-    <w:basedOn w:val="Normal"/>
+    <w:basedOn w:val="a"/>
     <w:uiPriority w:val="34"/>
     <w:qFormat/>
     <w:rsid w:val="00315081"/>
@@ -2904,9 +2407,9 @@
       <w:contextualSpacing/>
     </w:pPr>
   </w:style>
-  <w:style w:type="character" w:styleId="IntenseEmphasis">
+  <w:style w:type="character" w:styleId="aa">
     <w:name w:val="Intense Emphasis"/>
-    <w:basedOn w:val="DefaultParagraphFont"/>
+    <w:basedOn w:val="a0"/>
     <w:uiPriority w:val="21"/>
     <w:qFormat/>
     <w:rsid w:val="00315081"/>
@@ -2916,11 +2419,11 @@
       <w:color w:val="0F4761" w:themeColor="accent1" w:themeShade="BF"/>
     </w:rPr>
   </w:style>
-  <w:style w:type="paragraph" w:styleId="IntenseQuote">
+  <w:style w:type="paragraph" w:styleId="ab">
     <w:name w:val="Intense Quote"/>
-    <w:basedOn w:val="Normal"/>
-    <w:next w:val="Normal"/>
-    <w:link w:val="IntenseQuoteChar"/>
+    <w:basedOn w:val="a"/>
+    <w:next w:val="a"/>
+    <w:link w:val="ac"/>
     <w:uiPriority w:val="30"/>
     <w:qFormat/>
     <w:rsid w:val="00315081"/>
@@ -2939,10 +2442,10 @@
       <w:color w:val="0F4761" w:themeColor="accent1" w:themeShade="BF"/>
     </w:rPr>
   </w:style>
-  <w:style w:type="character" w:customStyle="1" w:styleId="IntenseQuoteChar">
-    <w:name w:val="Intense Quote Char"/>
-    <w:basedOn w:val="DefaultParagraphFont"/>
-    <w:link w:val="IntenseQuote"/>
+  <w:style w:type="character" w:customStyle="1" w:styleId="ac">
+    <w:name w:val="鮮明引文 字元"/>
+    <w:basedOn w:val="a0"/>
+    <w:link w:val="ab"/>
     <w:uiPriority w:val="30"/>
     <w:rsid w:val="00315081"/>
     <w:rPr>
@@ -2951,9 +2454,9 @@
       <w:color w:val="0F4761" w:themeColor="accent1" w:themeShade="BF"/>
     </w:rPr>
   </w:style>
-  <w:style w:type="character" w:styleId="IntenseReference">
+  <w:style w:type="character" w:styleId="ad">
     <w:name w:val="Intense Reference"/>
-    <w:basedOn w:val="DefaultParagraphFont"/>
+    <w:basedOn w:val="a0"/>
     <w:uiPriority w:val="32"/>
     <w:qFormat/>
     <w:rsid w:val="00315081"/>
@@ -2965,9 +2468,9 @@
       <w:spacing w:val="5"/>
     </w:rPr>
   </w:style>
-  <w:style w:type="table" w:styleId="TableGrid">
+  <w:style w:type="table" w:styleId="ae">
     <w:name w:val="Table Grid"/>
-    <w:basedOn w:val="TableNormal"/>
+    <w:basedOn w:val="a1"/>
     <w:uiPriority w:val="59"/>
     <w:rsid w:val="00920C7C"/>
     <w:pPr>
@@ -2983,6 +2486,66 @@
         <w:insideV w:val="single" w:sz="4" w:space="0" w:color="000000" w:themeColor="text1"/>
       </w:tblBorders>
     </w:tblPr>
+  </w:style>
+  <w:style w:type="paragraph" w:styleId="af">
+    <w:name w:val="header"/>
+    <w:basedOn w:val="a"/>
+    <w:link w:val="af0"/>
+    <w:uiPriority w:val="99"/>
+    <w:unhideWhenUsed/>
+    <w:rsid w:val="001305DE"/>
+    <w:pPr>
+      <w:tabs>
+        <w:tab w:val="center" w:pos="4153"/>
+        <w:tab w:val="right" w:pos="8306"/>
+      </w:tabs>
+      <w:snapToGrid w:val="0"/>
+    </w:pPr>
+    <w:rPr>
+      <w:sz w:val="20"/>
+      <w:szCs w:val="20"/>
+    </w:rPr>
+  </w:style>
+  <w:style w:type="character" w:customStyle="1" w:styleId="af0">
+    <w:name w:val="頁首 字元"/>
+    <w:basedOn w:val="a0"/>
+    <w:link w:val="af"/>
+    <w:uiPriority w:val="99"/>
+    <w:rsid w:val="001305DE"/>
+    <w:rPr>
+      <w:sz w:val="20"/>
+      <w:szCs w:val="20"/>
+    </w:rPr>
+  </w:style>
+  <w:style w:type="paragraph" w:styleId="af1">
+    <w:name w:val="footer"/>
+    <w:basedOn w:val="a"/>
+    <w:link w:val="af2"/>
+    <w:uiPriority w:val="99"/>
+    <w:unhideWhenUsed/>
+    <w:rsid w:val="001305DE"/>
+    <w:pPr>
+      <w:tabs>
+        <w:tab w:val="center" w:pos="4153"/>
+        <w:tab w:val="right" w:pos="8306"/>
+      </w:tabs>
+      <w:snapToGrid w:val="0"/>
+    </w:pPr>
+    <w:rPr>
+      <w:sz w:val="20"/>
+      <w:szCs w:val="20"/>
+    </w:rPr>
+  </w:style>
+  <w:style w:type="character" w:customStyle="1" w:styleId="af2">
+    <w:name w:val="頁尾 字元"/>
+    <w:basedOn w:val="a0"/>
+    <w:link w:val="af1"/>
+    <w:uiPriority w:val="99"/>
+    <w:rsid w:val="001305DE"/>
+    <w:rPr>
+      <w:sz w:val="20"/>
+      <w:szCs w:val="20"/>
+    </w:rPr>
   </w:style>
 </w:styles>
 </file>

</xml_diff>